<commit_message>
Continua en la casa
</commit_message>
<xml_diff>
--- a/Apuntes_GIT.docx
+++ b/Apuntes_GIT.docx
@@ -17,11 +17,9 @@
       <w:r>
         <w:t xml:space="preserve">Como </w:t>
       </w:r>
-      <w:proofErr w:type="spellStart"/>
-      <w:r>
-        <w:t>inizializar</w:t>
-      </w:r>
-      <w:proofErr w:type="spellEnd"/>
+      <w:r>
+        <w:t>inicializar</w:t>
+      </w:r>
       <w:r>
         <w:t xml:space="preserve"> una carpeta donde quieras tener un repositorio</w:t>
       </w:r>
@@ -104,13 +102,7 @@
     <w:p/>
     <w:p>
       <w:r>
-        <w:t xml:space="preserve">¿Qué es la rama </w:t>
-      </w:r>
-      <w:r>
-        <w:t xml:space="preserve">un </w:t>
-      </w:r>
-      <w:r>
-        <w:t>“</w:t>
+        <w:t>¿Qué es un “</w:t>
       </w:r>
       <w:proofErr w:type="spellStart"/>
       <w:r>
@@ -137,6 +129,274 @@
         <w:t>a versión.</w:t>
       </w:r>
     </w:p>
+    <w:p/>
+    <w:p>
+      <w:r>
+        <w:t xml:space="preserve">¿Qué hacer cuando tenemos </w:t>
+      </w:r>
+      <w:proofErr w:type="spellStart"/>
+      <w:r>
+        <w:t>untracked</w:t>
+      </w:r>
+      <w:proofErr w:type="spellEnd"/>
+      <w:r>
+        <w:t xml:space="preserve"> files?</w:t>
+      </w:r>
+    </w:p>
+    <w:p>
+      <w:r>
+        <w:t>Agregar el documento al tracking</w:t>
+      </w:r>
+      <w:r>
+        <w:br/>
+      </w:r>
+      <w:proofErr w:type="spellStart"/>
+      <w:r>
+        <w:t>git</w:t>
+      </w:r>
+      <w:proofErr w:type="spellEnd"/>
+      <w:r>
+        <w:t xml:space="preserve"> </w:t>
+      </w:r>
+      <w:proofErr w:type="spellStart"/>
+      <w:r>
+        <w:t>add</w:t>
+      </w:r>
+      <w:proofErr w:type="spellEnd"/>
+      <w:r>
+        <w:t xml:space="preserve"> [</w:t>
+      </w:r>
+      <w:proofErr w:type="spellStart"/>
+      <w:r>
+        <w:t>NombreDelArchivo.Extension</w:t>
+      </w:r>
+      <w:proofErr w:type="spellEnd"/>
+      <w:r>
+        <w:t>]</w:t>
+      </w:r>
+    </w:p>
+    <w:p/>
+    <w:p>
+      <w:r>
+        <w:t xml:space="preserve">Cuando se tiene un repositorio remoto ¿Cómo le podemos hacer para subir algún </w:t>
+      </w:r>
+      <w:proofErr w:type="spellStart"/>
+      <w:r>
+        <w:t>commit</w:t>
+      </w:r>
+      <w:proofErr w:type="spellEnd"/>
+      <w:r>
+        <w:t>?</w:t>
+      </w:r>
+    </w:p>
+    <w:p>
+      <w:proofErr w:type="spellStart"/>
+      <w:r>
+        <w:t>git</w:t>
+      </w:r>
+      <w:proofErr w:type="spellEnd"/>
+      <w:r>
+        <w:t xml:space="preserve"> </w:t>
+      </w:r>
+      <w:proofErr w:type="spellStart"/>
+      <w:r>
+        <w:t>push</w:t>
+      </w:r>
+      <w:proofErr w:type="spellEnd"/>
+      <w:r>
+        <w:t xml:space="preserve"> </w:t>
+      </w:r>
+      <w:proofErr w:type="spellStart"/>
+      <w:r>
+        <w:t>origin</w:t>
+      </w:r>
+      <w:proofErr w:type="spellEnd"/>
+      <w:r>
+        <w:t xml:space="preserve"> </w:t>
+      </w:r>
+      <w:proofErr w:type="spellStart"/>
+      <w:r>
+        <w:t>main</w:t>
+      </w:r>
+      <w:proofErr w:type="spellEnd"/>
+      <w:r>
+        <w:t xml:space="preserve"> // </w:t>
+      </w:r>
+      <w:proofErr w:type="spellStart"/>
+      <w:r>
+        <w:t>Main</w:t>
+      </w:r>
+      <w:proofErr w:type="spellEnd"/>
+      <w:r>
+        <w:t xml:space="preserve"> es la rama </w:t>
+      </w:r>
+    </w:p>
+    <w:p>
+      <w:r>
+        <w:t xml:space="preserve">Lo cual es: </w:t>
+      </w:r>
+      <w:r>
+        <w:t xml:space="preserve">sube </w:t>
+      </w:r>
+      <w:r>
+        <w:t>los</w:t>
+      </w:r>
+      <w:r>
+        <w:t xml:space="preserve"> </w:t>
+      </w:r>
+      <w:proofErr w:type="spellStart"/>
+      <w:r>
+        <w:t>commits</w:t>
+      </w:r>
+      <w:proofErr w:type="spellEnd"/>
+      <w:r>
+        <w:t xml:space="preserve"> de la rama </w:t>
+      </w:r>
+      <w:proofErr w:type="spellStart"/>
+      <w:r>
+        <w:t>main</w:t>
+      </w:r>
+      <w:proofErr w:type="spellEnd"/>
+      <w:r>
+        <w:t xml:space="preserve"> local al repositorio remoto llamado </w:t>
+      </w:r>
+      <w:proofErr w:type="spellStart"/>
+      <w:r>
+        <w:t>origin</w:t>
+      </w:r>
+      <w:proofErr w:type="spellEnd"/>
+    </w:p>
+    <w:p>
+      <w:r>
+        <w:t>Importante es ver en que rama local estamos y el nombre del repositorio remoto</w:t>
+      </w:r>
+    </w:p>
+    <w:p>
+      <w:proofErr w:type="gramStart"/>
+      <w:r>
+        <w:lastRenderedPageBreak/>
+        <w:t xml:space="preserve">Como le haces para ver los </w:t>
+      </w:r>
+      <w:proofErr w:type="spellStart"/>
+      <w:r>
+        <w:t>commit</w:t>
+      </w:r>
+      <w:proofErr w:type="spellEnd"/>
+      <w:r>
+        <w:t xml:space="preserve"> que llevas en tu repositorio?</w:t>
+      </w:r>
+      <w:proofErr w:type="gramEnd"/>
+    </w:p>
+    <w:p>
+      <w:proofErr w:type="spellStart"/>
+      <w:r>
+        <w:t>git</w:t>
+      </w:r>
+      <w:proofErr w:type="spellEnd"/>
+      <w:r>
+        <w:t xml:space="preserve"> log </w:t>
+      </w:r>
+      <w:r>
+        <w:t>–</w:t>
+      </w:r>
+      <w:proofErr w:type="spellStart"/>
+      <w:r>
+        <w:t>oneline</w:t>
+      </w:r>
+      <w:proofErr w:type="spellEnd"/>
+    </w:p>
+    <w:p/>
+    <w:p>
+      <w:r>
+        <w:t>Cómo crear una rama</w:t>
+      </w:r>
+    </w:p>
+    <w:p>
+      <w:proofErr w:type="spellStart"/>
+      <w:r>
+        <w:t>git</w:t>
+      </w:r>
+      <w:proofErr w:type="spellEnd"/>
+      <w:r>
+        <w:t xml:space="preserve"> </w:t>
+      </w:r>
+      <w:proofErr w:type="spellStart"/>
+      <w:r>
+        <w:t>branch</w:t>
+      </w:r>
+      <w:proofErr w:type="spellEnd"/>
+      <w:r>
+        <w:t xml:space="preserve"> </w:t>
+      </w:r>
+      <w:r>
+        <w:t>[</w:t>
+      </w:r>
+      <w:r>
+        <w:t>nombre-de-tu-rama</w:t>
+      </w:r>
+      <w:r>
+        <w:t>]</w:t>
+      </w:r>
+    </w:p>
+    <w:p/>
+    <w:p>
+      <w:r>
+        <w:t xml:space="preserve">Algo que hay que tomar en cuenta al crear una rama </w:t>
+      </w:r>
+      <w:proofErr w:type="gramStart"/>
+      <w:r>
+        <w:t>es..</w:t>
+      </w:r>
+      <w:proofErr w:type="gramEnd"/>
+    </w:p>
+    <w:p>
+      <w:r>
+        <w:t>Que hay que moverse a esa rama de donde estamos.</w:t>
+      </w:r>
+    </w:p>
+    <w:p>
+      <w:proofErr w:type="spellStart"/>
+      <w:r>
+        <w:t>git</w:t>
+      </w:r>
+      <w:proofErr w:type="spellEnd"/>
+      <w:r>
+        <w:t xml:space="preserve"> switch </w:t>
+      </w:r>
+      <w:r>
+        <w:t>[</w:t>
+      </w:r>
+      <w:r>
+        <w:t>nombre-de-tu-rama</w:t>
+      </w:r>
+      <w:r>
+        <w:t>]</w:t>
+      </w:r>
+    </w:p>
+    <w:p/>
+    <w:p>
+      <w:r>
+        <w:t xml:space="preserve">Como visualizar en que </w:t>
+      </w:r>
+      <w:r>
+        <w:t>Rama estamos</w:t>
+      </w:r>
+    </w:p>
+    <w:p>
+      <w:proofErr w:type="spellStart"/>
+      <w:r>
+        <w:t>git</w:t>
+      </w:r>
+      <w:proofErr w:type="spellEnd"/>
+      <w:r>
+        <w:t xml:space="preserve"> </w:t>
+      </w:r>
+      <w:r>
+        <w:t>Branch</w:t>
+      </w:r>
+    </w:p>
+    <w:p/>
+    <w:p/>
     <w:sectPr>
       <w:pgSz w:w="12240" w:h="15840"/>
       <w:pgMar w:top="1417" w:right="1701" w:bottom="1417" w:left="1701" w:header="708" w:footer="708" w:gutter="0"/>
@@ -574,6 +834,19 @@
     <w:semiHidden/>
     <w:unhideWhenUsed/>
   </w:style>
+  <w:style w:type="character" w:styleId="CdigoHTML">
+    <w:name w:val="HTML Code"/>
+    <w:basedOn w:val="Fuentedeprrafopredeter"/>
+    <w:uiPriority w:val="99"/>
+    <w:semiHidden/>
+    <w:unhideWhenUsed/>
+    <w:rsid w:val="00EF05A0"/>
+    <w:rPr>
+      <w:rFonts w:ascii="Courier New" w:eastAsia="Times New Roman" w:hAnsi="Courier New" w:cs="Courier New"/>
+      <w:sz w:val="20"/>
+      <w:szCs w:val="20"/>
+    </w:rPr>
+  </w:style>
 </w:styles>
 </file>
 

</xml_diff>

<commit_message>
Me cambié a Develop desde la casa y no guardé los nuevos apuntes de word
</commit_message>
<xml_diff>
--- a/Apuntes_GIT.docx
+++ b/Apuntes_GIT.docx
@@ -1,6 +1,6 @@
 
 <file path=word/document.xml><?xml version="1.0" encoding="utf-8"?>
-<w:document xmlns:wpc="http://schemas.microsoft.com/office/word/2010/wordprocessingCanvas" xmlns:cx="http://schemas.microsoft.com/office/drawing/2014/chartex" xmlns:cx1="http://schemas.microsoft.com/office/drawing/2015/9/8/chartex" xmlns:cx2="http://schemas.microsoft.com/office/drawing/2015/10/21/chartex" xmlns:cx3="http://schemas.microsoft.com/office/drawing/2016/5/9/chartex" xmlns:cx4="http://schemas.microsoft.com/office/drawing/2016/5/10/chartex" xmlns:cx5="http://schemas.microsoft.com/office/drawing/2016/5/11/chartex" xmlns:cx6="http://schemas.microsoft.com/office/drawing/2016/5/12/chartex" xmlns:cx7="http://schemas.microsoft.com/office/drawing/2016/5/13/chartex" xmlns:cx8="http://schemas.microsoft.com/office/drawing/2016/5/14/chartex" xmlns:mc="http://schemas.openxmlformats.org/markup-compatibility/2006" xmlns:aink="http://schemas.microsoft.com/office/drawing/2016/ink" xmlns:am3d="http://schemas.microsoft.com/office/drawing/2017/model3d" xmlns:o="urn:schemas-microsoft-com:office:office" xmlns:r="http://schemas.openxmlformats.org/officeDocument/2006/relationships" xmlns:m="http://schemas.openxmlformats.org/officeDocument/2006/math" xmlns:v="urn:schemas-microsoft-com:vml" xmlns:wp14="http://schemas.microsoft.com/office/word/2010/wordprocessingDrawing" xmlns:wp="http://schemas.openxmlformats.org/drawingml/2006/wordprocessingDrawing" xmlns:w10="urn:schemas-microsoft-com:office:word" xmlns:w="http://schemas.openxmlformats.org/wordprocessingml/2006/main" xmlns:w14="http://schemas.microsoft.com/office/word/2010/wordml" xmlns:w15="http://schemas.microsoft.com/office/word/2012/wordml" xmlns:w16cex="http://schemas.microsoft.com/office/word/2018/wordml/cex" xmlns:w16cid="http://schemas.microsoft.com/office/word/2016/wordml/cid" xmlns:w16="http://schemas.microsoft.com/office/word/2018/wordml" xmlns:w16sdtdh="http://schemas.microsoft.com/office/word/2020/wordml/sdtdatahash" xmlns:w16se="http://schemas.microsoft.com/office/word/2015/wordml/symex" xmlns:wpg="http://schemas.microsoft.com/office/word/2010/wordprocessingGroup" xmlns:wpi="http://schemas.microsoft.com/office/word/2010/wordprocessingInk" xmlns:wne="http://schemas.microsoft.com/office/word/2006/wordml" xmlns:wps="http://schemas.microsoft.com/office/word/2010/wordprocessingShape" mc:Ignorable="w14 w15 w16se w16cid w16 w16cex w16sdtdh wp14">
+<w:document xmlns:wpc="http://schemas.microsoft.com/office/word/2010/wordprocessingCanvas" xmlns:cx="http://schemas.microsoft.com/office/drawing/2014/chartex" xmlns:cx1="http://schemas.microsoft.com/office/drawing/2015/9/8/chartex" xmlns:cx2="http://schemas.microsoft.com/office/drawing/2015/10/21/chartex" xmlns:cx3="http://schemas.microsoft.com/office/drawing/2016/5/9/chartex" xmlns:cx4="http://schemas.microsoft.com/office/drawing/2016/5/10/chartex" xmlns:cx5="http://schemas.microsoft.com/office/drawing/2016/5/11/chartex" xmlns:cx6="http://schemas.microsoft.com/office/drawing/2016/5/12/chartex" xmlns:cx7="http://schemas.microsoft.com/office/drawing/2016/5/13/chartex" xmlns:cx8="http://schemas.microsoft.com/office/drawing/2016/5/14/chartex" xmlns:mc="http://schemas.openxmlformats.org/markup-compatibility/2006" xmlns:aink="http://schemas.microsoft.com/office/drawing/2016/ink" xmlns:am3d="http://schemas.microsoft.com/office/drawing/2017/model3d" xmlns:o="urn:schemas-microsoft-com:office:office" xmlns:oel="http://schemas.microsoft.com/office/2019/extlst" xmlns:r="http://schemas.openxmlformats.org/officeDocument/2006/relationships" xmlns:m="http://schemas.openxmlformats.org/officeDocument/2006/math" xmlns:v="urn:schemas-microsoft-com:vml" xmlns:wp14="http://schemas.microsoft.com/office/word/2010/wordprocessingDrawing" xmlns:wp="http://schemas.openxmlformats.org/drawingml/2006/wordprocessingDrawing" xmlns:w10="urn:schemas-microsoft-com:office:word" xmlns:w="http://schemas.openxmlformats.org/wordprocessingml/2006/main" xmlns:w14="http://schemas.microsoft.com/office/word/2010/wordml" xmlns:w15="http://schemas.microsoft.com/office/word/2012/wordml" xmlns:w16cex="http://schemas.microsoft.com/office/word/2018/wordml/cex" xmlns:w16cid="http://schemas.microsoft.com/office/word/2016/wordml/cid" xmlns:w16="http://schemas.microsoft.com/office/word/2018/wordml" xmlns:w16du="http://schemas.microsoft.com/office/word/2023/wordml/word16du" xmlns:w16sdtdh="http://schemas.microsoft.com/office/word/2020/wordml/sdtdatahash" xmlns:w16sdtfl="http://schemas.microsoft.com/office/word/2024/wordml/sdtformatlock" xmlns:w16se="http://schemas.microsoft.com/office/word/2015/wordml/symex" xmlns:wpg="http://schemas.microsoft.com/office/word/2010/wordprocessingGroup" xmlns:wpi="http://schemas.microsoft.com/office/word/2010/wordprocessingInk" xmlns:wne="http://schemas.microsoft.com/office/word/2006/wordml" xmlns:wps="http://schemas.microsoft.com/office/word/2010/wordprocessingShape" mc:Ignorable="w14 w15 w16se w16cid w16 w16cex w16sdtdh w16sdtfl w16du wp14">
   <w:body>
     <w:p>
       <w:r>
@@ -104,13 +104,7 @@
     <w:p/>
     <w:p>
       <w:r>
-        <w:t xml:space="preserve">¿Qué es la rama </w:t>
-      </w:r>
-      <w:r>
-        <w:t xml:space="preserve">un </w:t>
-      </w:r>
-      <w:r>
-        <w:t>“</w:t>
+        <w:t>¿Qué es la rama un “</w:t>
       </w:r>
       <w:proofErr w:type="spellStart"/>
       <w:r>
@@ -137,6 +131,18 @@
         <w:t>a versión.</w:t>
       </w:r>
     </w:p>
+    <w:p/>
+    <w:p>
+      <w:r>
+        <w:t>¿Cómo traer un repositorio remoto a uno local?</w:t>
+      </w:r>
+    </w:p>
+    <w:p>
+      <w:r>
+        <w:t>Git clone [URL]</w:t>
+      </w:r>
+    </w:p>
+    <w:p/>
     <w:sectPr>
       <w:pgSz w:w="12240" w:h="15840"/>
       <w:pgMar w:top="1417" w:right="1701" w:bottom="1417" w:left="1701" w:header="708" w:footer="708" w:gutter="0"/>
@@ -148,7 +154,7 @@
 </file>
 
 <file path=word/styles.xml><?xml version="1.0" encoding="utf-8"?>
-<w:styles xmlns:mc="http://schemas.openxmlformats.org/markup-compatibility/2006" xmlns:r="http://schemas.openxmlformats.org/officeDocument/2006/relationships" xmlns:w="http://schemas.openxmlformats.org/wordprocessingml/2006/main" xmlns:w14="http://schemas.microsoft.com/office/word/2010/wordml" xmlns:w15="http://schemas.microsoft.com/office/word/2012/wordml" xmlns:w16cex="http://schemas.microsoft.com/office/word/2018/wordml/cex" xmlns:w16cid="http://schemas.microsoft.com/office/word/2016/wordml/cid" xmlns:w16="http://schemas.microsoft.com/office/word/2018/wordml" xmlns:w16sdtdh="http://schemas.microsoft.com/office/word/2020/wordml/sdtdatahash" xmlns:w16se="http://schemas.microsoft.com/office/word/2015/wordml/symex" mc:Ignorable="w14 w15 w16se w16cid w16 w16cex w16sdtdh">
+<w:styles xmlns:mc="http://schemas.openxmlformats.org/markup-compatibility/2006" xmlns:r="http://schemas.openxmlformats.org/officeDocument/2006/relationships" xmlns:w="http://schemas.openxmlformats.org/wordprocessingml/2006/main" xmlns:w14="http://schemas.microsoft.com/office/word/2010/wordml" xmlns:w15="http://schemas.microsoft.com/office/word/2012/wordml" xmlns:w16cex="http://schemas.microsoft.com/office/word/2018/wordml/cex" xmlns:w16cid="http://schemas.microsoft.com/office/word/2016/wordml/cid" xmlns:w16="http://schemas.microsoft.com/office/word/2018/wordml" xmlns:w16du="http://schemas.microsoft.com/office/word/2023/wordml/word16du" xmlns:w16sdtdh="http://schemas.microsoft.com/office/word/2020/wordml/sdtdatahash" xmlns:w16sdtfl="http://schemas.microsoft.com/office/word/2024/wordml/sdtformatlock" xmlns:w16se="http://schemas.microsoft.com/office/word/2015/wordml/symex" mc:Ignorable="w14 w15 w16se w16cid w16 w16cex w16sdtdh w16sdtfl w16du">
   <w:docDefaults>
     <w:rPrDefault>
       <w:rPr>

</xml_diff>

<commit_message>
Haremos el merge para que todo quede en el main
</commit_message>
<xml_diff>
--- a/Apuntes_GIT.docx
+++ b/Apuntes_GIT.docx
@@ -1,6 +1,6 @@
 
 <file path=word/document.xml><?xml version="1.0" encoding="utf-8"?>
-<w:document xmlns:wpc="http://schemas.microsoft.com/office/word/2010/wordprocessingCanvas" xmlns:cx="http://schemas.microsoft.com/office/drawing/2014/chartex" xmlns:cx1="http://schemas.microsoft.com/office/drawing/2015/9/8/chartex" xmlns:cx2="http://schemas.microsoft.com/office/drawing/2015/10/21/chartex" xmlns:cx3="http://schemas.microsoft.com/office/drawing/2016/5/9/chartex" xmlns:cx4="http://schemas.microsoft.com/office/drawing/2016/5/10/chartex" xmlns:cx5="http://schemas.microsoft.com/office/drawing/2016/5/11/chartex" xmlns:cx6="http://schemas.microsoft.com/office/drawing/2016/5/12/chartex" xmlns:cx7="http://schemas.microsoft.com/office/drawing/2016/5/13/chartex" xmlns:cx8="http://schemas.microsoft.com/office/drawing/2016/5/14/chartex" xmlns:mc="http://schemas.openxmlformats.org/markup-compatibility/2006" xmlns:aink="http://schemas.microsoft.com/office/drawing/2016/ink" xmlns:am3d="http://schemas.microsoft.com/office/drawing/2017/model3d" xmlns:o="urn:schemas-microsoft-com:office:office" xmlns:r="http://schemas.openxmlformats.org/officeDocument/2006/relationships" xmlns:m="http://schemas.openxmlformats.org/officeDocument/2006/math" xmlns:v="urn:schemas-microsoft-com:vml" xmlns:wp14="http://schemas.microsoft.com/office/word/2010/wordprocessingDrawing" xmlns:wp="http://schemas.openxmlformats.org/drawingml/2006/wordprocessingDrawing" xmlns:w10="urn:schemas-microsoft-com:office:word" xmlns:w="http://schemas.openxmlformats.org/wordprocessingml/2006/main" xmlns:w14="http://schemas.microsoft.com/office/word/2010/wordml" xmlns:w15="http://schemas.microsoft.com/office/word/2012/wordml" xmlns:w16cex="http://schemas.microsoft.com/office/word/2018/wordml/cex" xmlns:w16cid="http://schemas.microsoft.com/office/word/2016/wordml/cid" xmlns:w16="http://schemas.microsoft.com/office/word/2018/wordml" xmlns:w16sdtdh="http://schemas.microsoft.com/office/word/2020/wordml/sdtdatahash" xmlns:w16se="http://schemas.microsoft.com/office/word/2015/wordml/symex" xmlns:wpg="http://schemas.microsoft.com/office/word/2010/wordprocessingGroup" xmlns:wpi="http://schemas.microsoft.com/office/word/2010/wordprocessingInk" xmlns:wne="http://schemas.microsoft.com/office/word/2006/wordml" xmlns:wps="http://schemas.microsoft.com/office/word/2010/wordprocessingShape" mc:Ignorable="w14 w15 w16se w16cid w16 w16cex w16sdtdh wp14">
+<w:document xmlns:wpc="http://schemas.microsoft.com/office/word/2010/wordprocessingCanvas" xmlns:cx="http://schemas.microsoft.com/office/drawing/2014/chartex" xmlns:cx1="http://schemas.microsoft.com/office/drawing/2015/9/8/chartex" xmlns:cx2="http://schemas.microsoft.com/office/drawing/2015/10/21/chartex" xmlns:cx3="http://schemas.microsoft.com/office/drawing/2016/5/9/chartex" xmlns:cx4="http://schemas.microsoft.com/office/drawing/2016/5/10/chartex" xmlns:cx5="http://schemas.microsoft.com/office/drawing/2016/5/11/chartex" xmlns:cx6="http://schemas.microsoft.com/office/drawing/2016/5/12/chartex" xmlns:cx7="http://schemas.microsoft.com/office/drawing/2016/5/13/chartex" xmlns:cx8="http://schemas.microsoft.com/office/drawing/2016/5/14/chartex" xmlns:mc="http://schemas.openxmlformats.org/markup-compatibility/2006" xmlns:aink="http://schemas.microsoft.com/office/drawing/2016/ink" xmlns:am3d="http://schemas.microsoft.com/office/drawing/2017/model3d" xmlns:o="urn:schemas-microsoft-com:office:office" xmlns:oel="http://schemas.microsoft.com/office/2019/extlst" xmlns:r="http://schemas.openxmlformats.org/officeDocument/2006/relationships" xmlns:m="http://schemas.openxmlformats.org/officeDocument/2006/math" xmlns:v="urn:schemas-microsoft-com:vml" xmlns:wp14="http://schemas.microsoft.com/office/word/2010/wordprocessingDrawing" xmlns:wp="http://schemas.openxmlformats.org/drawingml/2006/wordprocessingDrawing" xmlns:w10="urn:schemas-microsoft-com:office:word" xmlns:w="http://schemas.openxmlformats.org/wordprocessingml/2006/main" xmlns:w14="http://schemas.microsoft.com/office/word/2010/wordml" xmlns:w15="http://schemas.microsoft.com/office/word/2012/wordml" xmlns:w16cex="http://schemas.microsoft.com/office/word/2018/wordml/cex" xmlns:w16cid="http://schemas.microsoft.com/office/word/2016/wordml/cid" xmlns:w16="http://schemas.microsoft.com/office/word/2018/wordml" xmlns:w16du="http://schemas.microsoft.com/office/word/2023/wordml/word16du" xmlns:w16sdtdh="http://schemas.microsoft.com/office/word/2020/wordml/sdtdatahash" xmlns:w16sdtfl="http://schemas.microsoft.com/office/word/2024/wordml/sdtformatlock" xmlns:w16se="http://schemas.microsoft.com/office/word/2015/wordml/symex" xmlns:wpg="http://schemas.microsoft.com/office/word/2010/wordprocessingGroup" xmlns:wpi="http://schemas.microsoft.com/office/word/2010/wordprocessingInk" xmlns:wne="http://schemas.microsoft.com/office/word/2006/wordml" xmlns:wps="http://schemas.microsoft.com/office/word/2010/wordprocessingShape" mc:Ignorable="w14 w15 w16se w16cid w16 w16cex w16sdtdh w16sdtfl w16du wp14">
   <w:body>
     <w:p>
       <w:r>
@@ -132,6 +132,30 @@
     <w:p/>
     <w:p>
       <w:r>
+        <w:t xml:space="preserve">¿Cómo mostrar el historial de los </w:t>
+      </w:r>
+      <w:proofErr w:type="spellStart"/>
+      <w:r>
+        <w:t>commits</w:t>
+      </w:r>
+      <w:proofErr w:type="spellEnd"/>
+      <w:r>
+        <w:t>?</w:t>
+      </w:r>
+    </w:p>
+    <w:p>
+      <w:proofErr w:type="spellStart"/>
+      <w:r>
+        <w:t>git</w:t>
+      </w:r>
+      <w:proofErr w:type="spellEnd"/>
+      <w:r>
+        <w:t xml:space="preserve"> log</w:t>
+      </w:r>
+    </w:p>
+    <w:p/>
+    <w:p>
+      <w:r>
         <w:t xml:space="preserve">¿Qué hacer cuando tenemos </w:t>
       </w:r>
       <w:proofErr w:type="spellStart"/>
@@ -192,6 +216,7 @@
     <w:p>
       <w:proofErr w:type="spellStart"/>
       <w:r>
+        <w:lastRenderedPageBreak/>
         <w:t>git</w:t>
       </w:r>
       <w:proofErr w:type="spellEnd"/>
@@ -220,181 +245,322 @@
       </w:r>
       <w:proofErr w:type="spellEnd"/>
       <w:r>
-        <w:t xml:space="preserve"> // </w:t>
-      </w:r>
-      <w:proofErr w:type="spellStart"/>
-      <w:r>
-        <w:t>Main</w:t>
-      </w:r>
-      <w:proofErr w:type="spellEnd"/>
-      <w:r>
-        <w:t xml:space="preserve"> es la rama </w:t>
-      </w:r>
-    </w:p>
-    <w:p>
-      <w:r>
-        <w:t xml:space="preserve">Lo cual es: </w:t>
-      </w:r>
-      <w:r>
-        <w:t xml:space="preserve">sube </w:t>
-      </w:r>
-      <w:r>
-        <w:t>los</w:t>
-      </w:r>
+        <w:t xml:space="preserve"> // Main es la rama </w:t>
+      </w:r>
+    </w:p>
+    <w:p>
+      <w:r>
+        <w:t xml:space="preserve">Lo cual es: sube los </w:t>
+      </w:r>
+      <w:proofErr w:type="spellStart"/>
+      <w:r>
+        <w:t>commits</w:t>
+      </w:r>
+      <w:proofErr w:type="spellEnd"/>
+      <w:r>
+        <w:t xml:space="preserve"> de la rama </w:t>
+      </w:r>
+      <w:proofErr w:type="spellStart"/>
+      <w:r>
+        <w:t>main</w:t>
+      </w:r>
+      <w:proofErr w:type="spellEnd"/>
+      <w:r>
+        <w:t xml:space="preserve"> local al repositorio remoto llamado </w:t>
+      </w:r>
+      <w:proofErr w:type="spellStart"/>
+      <w:r>
+        <w:t>origin</w:t>
+      </w:r>
+      <w:proofErr w:type="spellEnd"/>
+    </w:p>
+    <w:p>
+      <w:r>
+        <w:t>Importante es ver en que rama local estamos y el nombre del repositorio remoto</w:t>
+      </w:r>
+    </w:p>
+    <w:p/>
+    <w:p>
+      <w:r>
+        <w:t>¿</w:t>
+      </w:r>
+      <w:r>
+        <w:t xml:space="preserve">Como le haces para ver los </w:t>
+      </w:r>
+      <w:proofErr w:type="spellStart"/>
+      <w:r>
+        <w:t>commit</w:t>
+      </w:r>
+      <w:proofErr w:type="spellEnd"/>
+      <w:r>
+        <w:t xml:space="preserve"> que llevas en tu repositorio</w:t>
+      </w:r>
+      <w:r>
+        <w:t xml:space="preserve"> de forma resumida</w:t>
+      </w:r>
+      <w:r>
+        <w:t>?</w:t>
+      </w:r>
+    </w:p>
+    <w:p>
+      <w:proofErr w:type="spellStart"/>
+      <w:r>
+        <w:t>git</w:t>
+      </w:r>
+      <w:proofErr w:type="spellEnd"/>
+      <w:r>
+        <w:t xml:space="preserve"> log </w:t>
+      </w:r>
+      <w:r>
+        <w:t>–</w:t>
+      </w:r>
+      <w:proofErr w:type="spellStart"/>
+      <w:r>
+        <w:t>oneline</w:t>
+      </w:r>
+      <w:proofErr w:type="spellEnd"/>
+    </w:p>
+    <w:p/>
+    <w:p>
+      <w:r>
+        <w:t>Cómo crear una rama</w:t>
+      </w:r>
+    </w:p>
+    <w:p>
+      <w:proofErr w:type="spellStart"/>
+      <w:r>
+        <w:t>git</w:t>
+      </w:r>
+      <w:proofErr w:type="spellEnd"/>
       <w:r>
         <w:t xml:space="preserve"> </w:t>
       </w:r>
       <w:proofErr w:type="spellStart"/>
       <w:r>
-        <w:t>commits</w:t>
-      </w:r>
-      <w:proofErr w:type="spellEnd"/>
-      <w:r>
-        <w:t xml:space="preserve"> de la rama </w:t>
+        <w:t>branch</w:t>
+      </w:r>
+      <w:proofErr w:type="spellEnd"/>
+      <w:r>
+        <w:t xml:space="preserve"> </w:t>
+      </w:r>
+      <w:r>
+        <w:t>[</w:t>
+      </w:r>
+      <w:r>
+        <w:t>nombre-de-tu-rama</w:t>
+      </w:r>
+      <w:r>
+        <w:t>]</w:t>
+      </w:r>
+    </w:p>
+    <w:p/>
+    <w:p>
+      <w:r>
+        <w:t xml:space="preserve">Algo que hay que tomar en cuenta al crear una rama </w:t>
+      </w:r>
+      <w:proofErr w:type="gramStart"/>
+      <w:r>
+        <w:t>es..</w:t>
+      </w:r>
+      <w:proofErr w:type="gramEnd"/>
+    </w:p>
+    <w:p>
+      <w:r>
+        <w:t>Que hay que moverse a esa rama de donde estamos.</w:t>
+      </w:r>
+    </w:p>
+    <w:p>
+      <w:proofErr w:type="spellStart"/>
+      <w:r>
+        <w:t>git</w:t>
+      </w:r>
+      <w:proofErr w:type="spellEnd"/>
+      <w:r>
+        <w:t xml:space="preserve"> switch </w:t>
+      </w:r>
+      <w:r>
+        <w:t>[</w:t>
+      </w:r>
+      <w:r>
+        <w:t>nombre-de-tu-rama</w:t>
+      </w:r>
+      <w:r>
+        <w:t>]</w:t>
+      </w:r>
+    </w:p>
+    <w:p/>
+    <w:p>
+      <w:r>
+        <w:t>¿Cómo cambiarte de rama?</w:t>
+      </w:r>
+    </w:p>
+    <w:p>
+      <w:proofErr w:type="spellStart"/>
+      <w:r>
+        <w:t>git</w:t>
+      </w:r>
+      <w:proofErr w:type="spellEnd"/>
+      <w:r>
+        <w:t xml:space="preserve"> switch </w:t>
+      </w:r>
+      <w:r>
+        <w:t>[</w:t>
+      </w:r>
+      <w:r>
+        <w:t>nombre-de-tu-rama</w:t>
+      </w:r>
+      <w:r>
+        <w:t>]</w:t>
+      </w:r>
+    </w:p>
+    <w:p/>
+    <w:p>
+      <w:r>
+        <w:t xml:space="preserve">Como visualizar en que </w:t>
+      </w:r>
+      <w:r>
+        <w:t>Rama estamos</w:t>
+      </w:r>
+    </w:p>
+    <w:p>
+      <w:proofErr w:type="spellStart"/>
+      <w:r>
+        <w:t>git</w:t>
+      </w:r>
+      <w:proofErr w:type="spellEnd"/>
+      <w:r>
+        <w:t xml:space="preserve"> </w:t>
+      </w:r>
+      <w:r>
+        <w:t>Branch</w:t>
+      </w:r>
+    </w:p>
+    <w:p/>
+    <w:p/>
+    <w:p>
+      <w:r>
+        <w:t>Como visualizar todas las Ramas (locales y remotas)</w:t>
+      </w:r>
+    </w:p>
+    <w:p>
+      <w:r>
+        <w:t>Git Branch -a</w:t>
+      </w:r>
+    </w:p>
+    <w:p/>
+    <w:p>
+      <w:r>
+        <w:t>¿Cómo traer un repositorio remoto a uno local?</w:t>
+      </w:r>
+    </w:p>
+    <w:p>
+      <w:proofErr w:type="spellStart"/>
+      <w:r>
+        <w:t>git</w:t>
+      </w:r>
+      <w:proofErr w:type="spellEnd"/>
+      <w:r>
+        <w:t xml:space="preserve"> clone </w:t>
+      </w:r>
+      <w:r>
+        <w:t>[URL]</w:t>
+      </w:r>
+    </w:p>
+    <w:p/>
+    <w:p>
+      <w:r>
+        <w:t xml:space="preserve">¿Cómo mostrar </w:t>
+      </w:r>
+      <w:r>
+        <w:t>los repositorios remotos conectados</w:t>
+      </w:r>
+      <w:r>
+        <w:t>?</w:t>
+      </w:r>
+    </w:p>
+    <w:p>
+      <w:proofErr w:type="spellStart"/>
+      <w:r>
+        <w:t>git</w:t>
+      </w:r>
+      <w:proofErr w:type="spellEnd"/>
+      <w:r>
+        <w:t xml:space="preserve"> remote -v</w:t>
+      </w:r>
+    </w:p>
+    <w:p>
+      <w:proofErr w:type="gramStart"/>
+      <w:r>
+        <w:lastRenderedPageBreak/>
+        <w:t>Cómo conectar un repositorio local con uno remoto?</w:t>
+      </w:r>
+      <w:proofErr w:type="gramEnd"/>
+    </w:p>
+    <w:p>
+      <w:proofErr w:type="spellStart"/>
+      <w:r>
+        <w:t>git</w:t>
+      </w:r>
+      <w:proofErr w:type="spellEnd"/>
+      <w:r>
+        <w:t xml:space="preserve"> remote </w:t>
+      </w:r>
+      <w:proofErr w:type="spellStart"/>
+      <w:r>
+        <w:t>add</w:t>
+      </w:r>
+      <w:proofErr w:type="spellEnd"/>
+      <w:r>
+        <w:t xml:space="preserve"> </w:t>
+      </w:r>
+      <w:proofErr w:type="spellStart"/>
+      <w:r>
+        <w:t>origin</w:t>
+      </w:r>
+      <w:proofErr w:type="spellEnd"/>
+      <w:r>
+        <w:t xml:space="preserve"> URL</w:t>
+      </w:r>
+    </w:p>
+    <w:p/>
+    <w:p>
+      <w:r>
+        <w:t>¿Cómo traer los cambios desde el repositorio remoto hacía el repositorio local?</w:t>
+      </w:r>
+    </w:p>
+    <w:p>
+      <w:proofErr w:type="spellStart"/>
+      <w:r>
+        <w:t>git</w:t>
+      </w:r>
+      <w:proofErr w:type="spellEnd"/>
+      <w:r>
+        <w:t xml:space="preserve"> </w:t>
+      </w:r>
+      <w:proofErr w:type="spellStart"/>
+      <w:r>
+        <w:t>pull</w:t>
+      </w:r>
+      <w:proofErr w:type="spellEnd"/>
+      <w:r>
+        <w:t xml:space="preserve"> </w:t>
+      </w:r>
+      <w:proofErr w:type="spellStart"/>
+      <w:r>
+        <w:t>origin</w:t>
+      </w:r>
+      <w:proofErr w:type="spellEnd"/>
+      <w:r>
+        <w:t xml:space="preserve"> </w:t>
       </w:r>
       <w:proofErr w:type="spellStart"/>
       <w:r>
         <w:t>main</w:t>
       </w:r>
       <w:proofErr w:type="spellEnd"/>
-      <w:r>
-        <w:t xml:space="preserve"> local al repositorio remoto llamado </w:t>
-      </w:r>
-      <w:proofErr w:type="spellStart"/>
-      <w:r>
-        <w:t>origin</w:t>
-      </w:r>
-      <w:proofErr w:type="spellEnd"/>
-    </w:p>
-    <w:p>
-      <w:r>
-        <w:t>Importante es ver en que rama local estamos y el nombre del repositorio remoto</w:t>
-      </w:r>
-    </w:p>
-    <w:p>
-      <w:proofErr w:type="gramStart"/>
-      <w:r>
-        <w:lastRenderedPageBreak/>
-        <w:t xml:space="preserve">Como le haces para ver los </w:t>
-      </w:r>
-      <w:proofErr w:type="spellStart"/>
-      <w:r>
-        <w:t>commit</w:t>
-      </w:r>
-      <w:proofErr w:type="spellEnd"/>
-      <w:r>
-        <w:t xml:space="preserve"> que llevas en tu repositorio?</w:t>
-      </w:r>
-      <w:proofErr w:type="gramEnd"/>
-    </w:p>
-    <w:p>
-      <w:proofErr w:type="spellStart"/>
-      <w:r>
-        <w:t>git</w:t>
-      </w:r>
-      <w:proofErr w:type="spellEnd"/>
-      <w:r>
-        <w:t xml:space="preserve"> log </w:t>
-      </w:r>
-      <w:r>
-        <w:t>–</w:t>
-      </w:r>
-      <w:proofErr w:type="spellStart"/>
-      <w:r>
-        <w:t>oneline</w:t>
-      </w:r>
-      <w:proofErr w:type="spellEnd"/>
-    </w:p>
-    <w:p/>
-    <w:p>
-      <w:r>
-        <w:t>Cómo crear una rama</w:t>
-      </w:r>
-    </w:p>
-    <w:p>
-      <w:proofErr w:type="spellStart"/>
-      <w:r>
-        <w:t>git</w:t>
-      </w:r>
-      <w:proofErr w:type="spellEnd"/>
-      <w:r>
-        <w:t xml:space="preserve"> </w:t>
-      </w:r>
-      <w:proofErr w:type="spellStart"/>
-      <w:r>
-        <w:t>branch</w:t>
-      </w:r>
-      <w:proofErr w:type="spellEnd"/>
-      <w:r>
-        <w:t xml:space="preserve"> </w:t>
-      </w:r>
-      <w:r>
-        <w:t>[</w:t>
-      </w:r>
-      <w:r>
-        <w:t>nombre-de-tu-rama</w:t>
-      </w:r>
-      <w:r>
-        <w:t>]</w:t>
-      </w:r>
-    </w:p>
-    <w:p/>
-    <w:p>
-      <w:r>
-        <w:t xml:space="preserve">Algo que hay que tomar en cuenta al crear una rama </w:t>
-      </w:r>
-      <w:proofErr w:type="gramStart"/>
-      <w:r>
-        <w:t>es..</w:t>
-      </w:r>
-      <w:proofErr w:type="gramEnd"/>
-    </w:p>
-    <w:p>
-      <w:r>
-        <w:t>Que hay que moverse a esa rama de donde estamos.</w:t>
-      </w:r>
-    </w:p>
-    <w:p>
-      <w:proofErr w:type="spellStart"/>
-      <w:r>
-        <w:t>git</w:t>
-      </w:r>
-      <w:proofErr w:type="spellEnd"/>
-      <w:r>
-        <w:t xml:space="preserve"> switch </w:t>
-      </w:r>
-      <w:r>
-        <w:t>[</w:t>
-      </w:r>
-      <w:r>
-        <w:t>nombre-de-tu-rama</w:t>
-      </w:r>
-      <w:r>
-        <w:t>]</w:t>
-      </w:r>
-    </w:p>
-    <w:p/>
-    <w:p>
-      <w:r>
-        <w:t xml:space="preserve">Como visualizar en que </w:t>
-      </w:r>
-      <w:r>
-        <w:t>Rama estamos</w:t>
-      </w:r>
-    </w:p>
-    <w:p>
-      <w:proofErr w:type="spellStart"/>
-      <w:r>
-        <w:t>git</w:t>
-      </w:r>
-      <w:proofErr w:type="spellEnd"/>
-      <w:r>
-        <w:t xml:space="preserve"> </w:t>
-      </w:r>
-      <w:r>
-        <w:t>Branch</w:t>
-      </w:r>
-    </w:p>
+    </w:p>
+    <w:p/>
+    <w:p/>
     <w:p/>
     <w:p/>
     <w:sectPr>
@@ -408,7 +574,7 @@
 </file>
 
 <file path=word/styles.xml><?xml version="1.0" encoding="utf-8"?>
-<w:styles xmlns:mc="http://schemas.openxmlformats.org/markup-compatibility/2006" xmlns:r="http://schemas.openxmlformats.org/officeDocument/2006/relationships" xmlns:w="http://schemas.openxmlformats.org/wordprocessingml/2006/main" xmlns:w14="http://schemas.microsoft.com/office/word/2010/wordml" xmlns:w15="http://schemas.microsoft.com/office/word/2012/wordml" xmlns:w16cex="http://schemas.microsoft.com/office/word/2018/wordml/cex" xmlns:w16cid="http://schemas.microsoft.com/office/word/2016/wordml/cid" xmlns:w16="http://schemas.microsoft.com/office/word/2018/wordml" xmlns:w16sdtdh="http://schemas.microsoft.com/office/word/2020/wordml/sdtdatahash" xmlns:w16se="http://schemas.microsoft.com/office/word/2015/wordml/symex" mc:Ignorable="w14 w15 w16se w16cid w16 w16cex w16sdtdh">
+<w:styles xmlns:mc="http://schemas.openxmlformats.org/markup-compatibility/2006" xmlns:r="http://schemas.openxmlformats.org/officeDocument/2006/relationships" xmlns:w="http://schemas.openxmlformats.org/wordprocessingml/2006/main" xmlns:w14="http://schemas.microsoft.com/office/word/2010/wordml" xmlns:w15="http://schemas.microsoft.com/office/word/2012/wordml" xmlns:w16cex="http://schemas.microsoft.com/office/word/2018/wordml/cex" xmlns:w16cid="http://schemas.microsoft.com/office/word/2016/wordml/cid" xmlns:w16="http://schemas.microsoft.com/office/word/2018/wordml" xmlns:w16du="http://schemas.microsoft.com/office/word/2023/wordml/word16du" xmlns:w16sdtdh="http://schemas.microsoft.com/office/word/2020/wordml/sdtdatahash" xmlns:w16sdtfl="http://schemas.microsoft.com/office/word/2024/wordml/sdtformatlock" xmlns:w16se="http://schemas.microsoft.com/office/word/2015/wordml/symex" mc:Ignorable="w14 w15 w16se w16cid w16 w16cex w16sdtdh w16sdtfl w16du">
   <w:docDefaults>
     <w:rPrDefault>
       <w:rPr>
@@ -810,7 +976,6 @@
   <w:style w:type="character" w:default="1" w:styleId="Fuentedeprrafopredeter">
     <w:name w:val="Default Paragraph Font"/>
     <w:uiPriority w:val="1"/>
-    <w:semiHidden/>
     <w:unhideWhenUsed/>
   </w:style>
   <w:style w:type="table" w:default="1" w:styleId="Tablanormal">

</xml_diff>

<commit_message>
Agregué 2 preguntas más desde la Rama DevelopCarso
</commit_message>
<xml_diff>
--- a/Apuntes_GIT.docx
+++ b/Apuntes_GIT.docx
@@ -1,8 +1,11 @@
 
 <file path=word/document.xml><?xml version="1.0" encoding="utf-8"?>
-<w:document xmlns:wpc="http://schemas.microsoft.com/office/word/2010/wordprocessingCanvas" xmlns:cx="http://schemas.microsoft.com/office/drawing/2014/chartex" xmlns:cx1="http://schemas.microsoft.com/office/drawing/2015/9/8/chartex" xmlns:cx2="http://schemas.microsoft.com/office/drawing/2015/10/21/chartex" xmlns:cx3="http://schemas.microsoft.com/office/drawing/2016/5/9/chartex" xmlns:cx4="http://schemas.microsoft.com/office/drawing/2016/5/10/chartex" xmlns:cx5="http://schemas.microsoft.com/office/drawing/2016/5/11/chartex" xmlns:cx6="http://schemas.microsoft.com/office/drawing/2016/5/12/chartex" xmlns:cx7="http://schemas.microsoft.com/office/drawing/2016/5/13/chartex" xmlns:cx8="http://schemas.microsoft.com/office/drawing/2016/5/14/chartex" xmlns:mc="http://schemas.openxmlformats.org/markup-compatibility/2006" xmlns:aink="http://schemas.microsoft.com/office/drawing/2016/ink" xmlns:am3d="http://schemas.microsoft.com/office/drawing/2017/model3d" xmlns:o="urn:schemas-microsoft-com:office:office" xmlns:oel="http://schemas.microsoft.com/office/2019/extlst" xmlns:r="http://schemas.openxmlformats.org/officeDocument/2006/relationships" xmlns:m="http://schemas.openxmlformats.org/officeDocument/2006/math" xmlns:v="urn:schemas-microsoft-com:vml" xmlns:wp14="http://schemas.microsoft.com/office/word/2010/wordprocessingDrawing" xmlns:wp="http://schemas.openxmlformats.org/drawingml/2006/wordprocessingDrawing" xmlns:w10="urn:schemas-microsoft-com:office:word" xmlns:w="http://schemas.openxmlformats.org/wordprocessingml/2006/main" xmlns:w14="http://schemas.microsoft.com/office/word/2010/wordml" xmlns:w15="http://schemas.microsoft.com/office/word/2012/wordml" xmlns:w16cex="http://schemas.microsoft.com/office/word/2018/wordml/cex" xmlns:w16cid="http://schemas.microsoft.com/office/word/2016/wordml/cid" xmlns:w16="http://schemas.microsoft.com/office/word/2018/wordml" xmlns:w16du="http://schemas.microsoft.com/office/word/2023/wordml/word16du" xmlns:w16sdtdh="http://schemas.microsoft.com/office/word/2020/wordml/sdtdatahash" xmlns:w16sdtfl="http://schemas.microsoft.com/office/word/2024/wordml/sdtformatlock" xmlns:w16se="http://schemas.microsoft.com/office/word/2015/wordml/symex" xmlns:wpg="http://schemas.microsoft.com/office/word/2010/wordprocessingGroup" xmlns:wpi="http://schemas.microsoft.com/office/word/2010/wordprocessingInk" xmlns:wne="http://schemas.microsoft.com/office/word/2006/wordml" xmlns:wps="http://schemas.microsoft.com/office/word/2010/wordprocessingShape" mc:Ignorable="w14 w15 w16se w16cid w16 w16cex w16sdtdh w16sdtfl w16du wp14">
+<w:document xmlns:wpc="http://schemas.microsoft.com/office/word/2010/wordprocessingCanvas" xmlns:cx="http://schemas.microsoft.com/office/drawing/2014/chartex" xmlns:cx1="http://schemas.microsoft.com/office/drawing/2015/9/8/chartex" xmlns:cx2="http://schemas.microsoft.com/office/drawing/2015/10/21/chartex" xmlns:cx3="http://schemas.microsoft.com/office/drawing/2016/5/9/chartex" xmlns:cx4="http://schemas.microsoft.com/office/drawing/2016/5/10/chartex" xmlns:cx5="http://schemas.microsoft.com/office/drawing/2016/5/11/chartex" xmlns:cx6="http://schemas.microsoft.com/office/drawing/2016/5/12/chartex" xmlns:cx7="http://schemas.microsoft.com/office/drawing/2016/5/13/chartex" xmlns:cx8="http://schemas.microsoft.com/office/drawing/2016/5/14/chartex" xmlns:mc="http://schemas.openxmlformats.org/markup-compatibility/2006" xmlns:aink="http://schemas.microsoft.com/office/drawing/2016/ink" xmlns:am3d="http://schemas.microsoft.com/office/drawing/2017/model3d" xmlns:o="urn:schemas-microsoft-com:office:office" xmlns:oel="http://schemas.microsoft.com/office/2019/extlst" xmlns:r="http://schemas.openxmlformats.org/officeDocument/2006/relationships" xmlns:m="http://schemas.openxmlformats.org/officeDocument/2006/math" xmlns:v="urn:schemas-microsoft-com:vml" xmlns:wp14="http://schemas.microsoft.com/office/word/2010/wordprocessingDrawing" xmlns:wp="http://schemas.openxmlformats.org/drawingml/2006/wordprocessingDrawing" xmlns:w10="urn:schemas-microsoft-com:office:word" xmlns:w="http://schemas.openxmlformats.org/wordprocessingml/2006/main" xmlns:w14="http://schemas.microsoft.com/office/word/2010/wordml" xmlns:w15="http://schemas.microsoft.com/office/word/2012/wordml" xmlns:w16cex="http://schemas.microsoft.com/office/word/2018/wordml/cex" xmlns:w16cid="http://schemas.microsoft.com/office/word/2016/wordml/cid" xmlns:w16="http://schemas.microsoft.com/office/word/2018/wordml" xmlns:w16sdtdh="http://schemas.microsoft.com/office/word/2020/wordml/sdtdatahash" xmlns:w16se="http://schemas.microsoft.com/office/word/2015/wordml/symex" xmlns:wpg="http://schemas.microsoft.com/office/word/2010/wordprocessingGroup" xmlns:wpi="http://schemas.microsoft.com/office/word/2010/wordprocessingInk" xmlns:wne="http://schemas.microsoft.com/office/word/2006/wordml" xmlns:wps="http://schemas.microsoft.com/office/word/2010/wordprocessingShape" mc:Ignorable="w14 w15 w16se w16cid w16 w16cex w16sdtdh wp14">
   <w:body>
     <w:p>
+      <w:r>
+        <w:t xml:space="preserve"> </w:t>
+      </w:r>
       <w:r>
         <w:t>¿Qué es Hit?</w:t>
       </w:r>
@@ -535,11 +538,55 @@
       </w:r>
       <w:proofErr w:type="spellEnd"/>
       <w:r>
+        <w:t xml:space="preserve"> pull </w:t>
+      </w:r>
+      <w:proofErr w:type="spellStart"/>
+      <w:r>
+        <w:t>origin</w:t>
+      </w:r>
+      <w:proofErr w:type="spellEnd"/>
+      <w:r>
         <w:t xml:space="preserve"> </w:t>
       </w:r>
       <w:proofErr w:type="spellStart"/>
       <w:r>
-        <w:t>pull</w:t>
+        <w:t>main</w:t>
+      </w:r>
+      <w:proofErr w:type="spellEnd"/>
+    </w:p>
+    <w:p/>
+    <w:p>
+      <w:proofErr w:type="gramStart"/>
+      <w:r>
+        <w:t>¿</w:t>
+      </w:r>
+      <w:r>
+        <w:t xml:space="preserve"> cómo</w:t>
+      </w:r>
+      <w:proofErr w:type="gramEnd"/>
+      <w:r>
+        <w:t xml:space="preserve"> saber en </w:t>
+      </w:r>
+      <w:r>
+        <w:t>qué</w:t>
+      </w:r>
+      <w:r>
+        <w:t xml:space="preserve"> carpeta está mi repositorio</w:t>
+      </w:r>
+      <w:r>
+        <w:t>?</w:t>
+      </w:r>
+    </w:p>
+    <w:p>
+      <w:r>
+        <w:t>Meterte a una carpeta donde pueda estar el repositorio y escribir el código:</w:t>
+      </w:r>
+      <w:r>
+        <w:br/>
+      </w:r>
+      <w:proofErr w:type="spellStart"/>
+      <w:r>
+        <w:t>git</w:t>
       </w:r>
       <w:proofErr w:type="spellEnd"/>
       <w:r>
@@ -547,21 +594,295 @@
       </w:r>
       <w:proofErr w:type="spellStart"/>
       <w:r>
-        <w:t>origin</w:t>
+        <w:t>rev-parse</w:t>
+      </w:r>
+      <w:proofErr w:type="spellEnd"/>
+      <w:r>
+        <w:t xml:space="preserve"> --show-</w:t>
+      </w:r>
+      <w:proofErr w:type="spellStart"/>
+      <w:r>
+        <w:t>toplevel</w:t>
+      </w:r>
+      <w:proofErr w:type="spellEnd"/>
+    </w:p>
+    <w:p/>
+    <w:p>
+      <w:r>
+        <w:t xml:space="preserve">¿Cómo se produce un conflicto en </w:t>
+      </w:r>
+      <w:proofErr w:type="spellStart"/>
+      <w:r>
+        <w:t>git</w:t>
+      </w:r>
+      <w:proofErr w:type="spellEnd"/>
+      <w:r>
+        <w:t>?</w:t>
+      </w:r>
+    </w:p>
+    <w:p>
+      <w:r>
+        <w:t>En Git, un conflicto aparece cuando dos personas modifican la misma parte de un archivo y Git no sabe cuál versión debe conservar.</w:t>
+      </w:r>
+      <w:r>
+        <w:br/>
+      </w:r>
+      <w:r>
+        <w:br/>
+      </w:r>
+      <w:r>
+        <w:rPr>
+          <w:b/>
+          <w:bCs/>
+          <w:i/>
+          <w:iCs/>
+        </w:rPr>
+        <w:t>! [</w:t>
+      </w:r>
+      <w:proofErr w:type="spellStart"/>
+      <w:r>
+        <w:rPr>
+          <w:b/>
+          <w:bCs/>
+          <w:i/>
+          <w:iCs/>
+        </w:rPr>
+        <w:t>rejected</w:t>
+      </w:r>
+      <w:proofErr w:type="spellEnd"/>
+      <w:r>
+        <w:rPr>
+          <w:b/>
+          <w:bCs/>
+          <w:i/>
+          <w:iCs/>
+        </w:rPr>
+        <w:t xml:space="preserve">] </w:t>
+      </w:r>
+      <w:proofErr w:type="spellStart"/>
+      <w:r>
+        <w:rPr>
+          <w:b/>
+          <w:bCs/>
+          <w:i/>
+          <w:iCs/>
+        </w:rPr>
+        <w:t>develop</w:t>
+      </w:r>
+      <w:proofErr w:type="spellEnd"/>
+      <w:r>
+        <w:rPr>
+          <w:b/>
+          <w:bCs/>
+          <w:i/>
+          <w:iCs/>
+        </w:rPr>
+        <w:t xml:space="preserve"> -&gt; </w:t>
+      </w:r>
+      <w:proofErr w:type="spellStart"/>
+      <w:r>
+        <w:rPr>
+          <w:b/>
+          <w:bCs/>
+          <w:i/>
+          <w:iCs/>
+        </w:rPr>
+        <w:t>develop</w:t>
+      </w:r>
+      <w:proofErr w:type="spellEnd"/>
+    </w:p>
+    <w:p>
+      <w:r>
+        <w:t>Archivo.txt</w:t>
+      </w:r>
+    </w:p>
+    <w:p>
+      <w:r>
+        <w:t>Servidor = EDINTELSA</w:t>
+      </w:r>
+    </w:p>
+    <w:p>
+      <w:r>
+        <w:t>Puerto = 8080</w:t>
+      </w:r>
+    </w:p>
+    <w:p/>
+    <w:p>
+      <w:r>
+        <w:t>P</w:t>
+      </w:r>
+      <w:r>
+        <w:t>c1:</w:t>
+      </w:r>
+      <w:r>
+        <w:br/>
+        <w:t>Puerto = 5000</w:t>
+      </w:r>
+    </w:p>
+    <w:p>
+      <w:proofErr w:type="spellStart"/>
+      <w:r>
+        <w:t>git</w:t>
       </w:r>
       <w:proofErr w:type="spellEnd"/>
       <w:r>
         <w:t xml:space="preserve"> </w:t>
       </w:r>
       <w:proofErr w:type="spellStart"/>
-      <w:r>
-        <w:t>main</w:t>
-      </w:r>
-      <w:proofErr w:type="spellEnd"/>
-    </w:p>
-    <w:p/>
-    <w:p/>
-    <w:p/>
+      <w:proofErr w:type="gramStart"/>
+      <w:r>
+        <w:t>add</w:t>
+      </w:r>
+      <w:proofErr w:type="spellEnd"/>
+      <w:r>
+        <w:t xml:space="preserve"> .</w:t>
+      </w:r>
+      <w:proofErr w:type="gramEnd"/>
+    </w:p>
+    <w:p>
+      <w:proofErr w:type="spellStart"/>
+      <w:r>
+        <w:t>git</w:t>
+      </w:r>
+      <w:proofErr w:type="spellEnd"/>
+      <w:r>
+        <w:t xml:space="preserve"> </w:t>
+      </w:r>
+      <w:proofErr w:type="spellStart"/>
+      <w:r>
+        <w:t>commit</w:t>
+      </w:r>
+      <w:proofErr w:type="spellEnd"/>
+      <w:r>
+        <w:t xml:space="preserve"> -m "Cambiar puerto"</w:t>
+      </w:r>
+    </w:p>
+    <w:p>
+      <w:proofErr w:type="spellStart"/>
+      <w:r>
+        <w:t>git</w:t>
+      </w:r>
+      <w:proofErr w:type="spellEnd"/>
+      <w:r>
+        <w:t xml:space="preserve"> </w:t>
+      </w:r>
+      <w:proofErr w:type="spellStart"/>
+      <w:r>
+        <w:t>push</w:t>
+      </w:r>
+      <w:proofErr w:type="spellEnd"/>
+    </w:p>
+    <w:p/>
+    <w:p>
+      <w:r>
+        <w:t>Pc2</w:t>
+      </w:r>
+      <w:r>
+        <w:br/>
+        <w:t>Puerto</w:t>
+      </w:r>
+      <w:r>
+        <w:t xml:space="preserve"> = 3000</w:t>
+      </w:r>
+    </w:p>
+    <w:p>
+      <w:proofErr w:type="spellStart"/>
+      <w:r>
+        <w:t>git</w:t>
+      </w:r>
+      <w:proofErr w:type="spellEnd"/>
+      <w:r>
+        <w:t xml:space="preserve"> </w:t>
+      </w:r>
+      <w:proofErr w:type="spellStart"/>
+      <w:proofErr w:type="gramStart"/>
+      <w:r>
+        <w:t>add</w:t>
+      </w:r>
+      <w:proofErr w:type="spellEnd"/>
+      <w:r>
+        <w:t xml:space="preserve"> .</w:t>
+      </w:r>
+      <w:proofErr w:type="gramEnd"/>
+    </w:p>
+    <w:p>
+      <w:proofErr w:type="spellStart"/>
+      <w:r>
+        <w:t>git</w:t>
+      </w:r>
+      <w:proofErr w:type="spellEnd"/>
+      <w:r>
+        <w:t xml:space="preserve"> </w:t>
+      </w:r>
+      <w:proofErr w:type="spellStart"/>
+      <w:r>
+        <w:t>commit</w:t>
+      </w:r>
+      <w:proofErr w:type="spellEnd"/>
+      <w:r>
+        <w:t xml:space="preserve"> -m "Actualizar puerto"</w:t>
+      </w:r>
+    </w:p>
+    <w:p>
+      <w:proofErr w:type="spellStart"/>
+      <w:r>
+        <w:t>git</w:t>
+      </w:r>
+      <w:proofErr w:type="spellEnd"/>
+      <w:r>
+        <w:t xml:space="preserve"> </w:t>
+      </w:r>
+      <w:proofErr w:type="spellStart"/>
+      <w:r>
+        <w:t>push</w:t>
+      </w:r>
+      <w:proofErr w:type="spellEnd"/>
+      <w:r>
+        <w:br/>
+      </w:r>
+      <w:r>
+        <w:br/>
+      </w:r>
+    </w:p>
+    <w:p/>
+    <w:p/>
+    <w:p>
+      <w:r>
+        <w:t xml:space="preserve">¿Qué es </w:t>
+      </w:r>
+      <w:proofErr w:type="spellStart"/>
+      <w:r>
+        <w:t>feature</w:t>
+      </w:r>
+      <w:proofErr w:type="spellEnd"/>
+      <w:r>
+        <w:t xml:space="preserve"> en </w:t>
+      </w:r>
+      <w:proofErr w:type="spellStart"/>
+      <w:r>
+        <w:t>gitflow</w:t>
+      </w:r>
+      <w:proofErr w:type="spellEnd"/>
+      <w:r>
+        <w:t>?</w:t>
+      </w:r>
+    </w:p>
+    <w:p>
+      <w:r>
+        <w:t>E</w:t>
+      </w:r>
+      <w:r>
+        <w:t xml:space="preserve">s simplemente una rama temporal creada para desarrollar una funcionalidad específica del proyecto sin tocar directamente </w:t>
+      </w:r>
+      <w:proofErr w:type="spellStart"/>
+      <w:r>
+        <w:t>develop</w:t>
+      </w:r>
+      <w:proofErr w:type="spellEnd"/>
+      <w:r>
+        <w:t>.</w:t>
+      </w:r>
+    </w:p>
     <w:p/>
     <w:sectPr>
       <w:pgSz w:w="12240" w:h="15840"/>
@@ -574,7 +895,7 @@
 </file>
 
 <file path=word/styles.xml><?xml version="1.0" encoding="utf-8"?>
-<w:styles xmlns:mc="http://schemas.openxmlformats.org/markup-compatibility/2006" xmlns:r="http://schemas.openxmlformats.org/officeDocument/2006/relationships" xmlns:w="http://schemas.openxmlformats.org/wordprocessingml/2006/main" xmlns:w14="http://schemas.microsoft.com/office/word/2010/wordml" xmlns:w15="http://schemas.microsoft.com/office/word/2012/wordml" xmlns:w16cex="http://schemas.microsoft.com/office/word/2018/wordml/cex" xmlns:w16cid="http://schemas.microsoft.com/office/word/2016/wordml/cid" xmlns:w16="http://schemas.microsoft.com/office/word/2018/wordml" xmlns:w16du="http://schemas.microsoft.com/office/word/2023/wordml/word16du" xmlns:w16sdtdh="http://schemas.microsoft.com/office/word/2020/wordml/sdtdatahash" xmlns:w16sdtfl="http://schemas.microsoft.com/office/word/2024/wordml/sdtformatlock" xmlns:w16se="http://schemas.microsoft.com/office/word/2015/wordml/symex" mc:Ignorable="w14 w15 w16se w16cid w16 w16cex w16sdtdh w16sdtfl w16du">
+<w:styles xmlns:mc="http://schemas.openxmlformats.org/markup-compatibility/2006" xmlns:r="http://schemas.openxmlformats.org/officeDocument/2006/relationships" xmlns:w="http://schemas.openxmlformats.org/wordprocessingml/2006/main" xmlns:w14="http://schemas.microsoft.com/office/word/2010/wordml" xmlns:w15="http://schemas.microsoft.com/office/word/2012/wordml" xmlns:w16cex="http://schemas.microsoft.com/office/word/2018/wordml/cex" xmlns:w16cid="http://schemas.microsoft.com/office/word/2016/wordml/cid" xmlns:w16="http://schemas.microsoft.com/office/word/2018/wordml" xmlns:w16sdtdh="http://schemas.microsoft.com/office/word/2020/wordml/sdtdatahash" xmlns:w16se="http://schemas.microsoft.com/office/word/2015/wordml/symex" mc:Ignorable="w14 w15 w16se w16cid w16 w16cex w16sdtdh">
   <w:docDefaults>
     <w:rPrDefault>
       <w:rPr>

</xml_diff>

<commit_message>
Baje la rama de Carso y en Ley le agregué una pregunta, ahora la voy a querer copiar a Develop
</commit_message>
<xml_diff>
--- a/Apuntes_GIT.docx
+++ b/Apuntes_GIT.docx
@@ -1,7 +1,9 @@
 
 <file path=word/document.xml><?xml version="1.0" encoding="utf-8"?>
-<w:document xmlns:wpc="http://schemas.microsoft.com/office/word/2010/wordprocessingCanvas" xmlns:cx="http://schemas.microsoft.com/office/drawing/2014/chartex" xmlns:cx1="http://schemas.microsoft.com/office/drawing/2015/9/8/chartex" xmlns:cx2="http://schemas.microsoft.com/office/drawing/2015/10/21/chartex" xmlns:cx3="http://schemas.microsoft.com/office/drawing/2016/5/9/chartex" xmlns:cx4="http://schemas.microsoft.com/office/drawing/2016/5/10/chartex" xmlns:cx5="http://schemas.microsoft.com/office/drawing/2016/5/11/chartex" xmlns:cx6="http://schemas.microsoft.com/office/drawing/2016/5/12/chartex" xmlns:cx7="http://schemas.microsoft.com/office/drawing/2016/5/13/chartex" xmlns:cx8="http://schemas.microsoft.com/office/drawing/2016/5/14/chartex" xmlns:mc="http://schemas.openxmlformats.org/markup-compatibility/2006" xmlns:aink="http://schemas.microsoft.com/office/drawing/2016/ink" xmlns:am3d="http://schemas.microsoft.com/office/drawing/2017/model3d" xmlns:o="urn:schemas-microsoft-com:office:office" xmlns:oel="http://schemas.microsoft.com/office/2019/extlst" xmlns:r="http://schemas.openxmlformats.org/officeDocument/2006/relationships" xmlns:m="http://schemas.openxmlformats.org/officeDocument/2006/math" xmlns:v="urn:schemas-microsoft-com:vml" xmlns:wp14="http://schemas.microsoft.com/office/word/2010/wordprocessingDrawing" xmlns:wp="http://schemas.openxmlformats.org/drawingml/2006/wordprocessingDrawing" xmlns:w10="urn:schemas-microsoft-com:office:word" xmlns:w="http://schemas.openxmlformats.org/wordprocessingml/2006/main" xmlns:w14="http://schemas.microsoft.com/office/word/2010/wordml" xmlns:w15="http://schemas.microsoft.com/office/word/2012/wordml" xmlns:w16cex="http://schemas.microsoft.com/office/word/2018/wordml/cex" xmlns:w16cid="http://schemas.microsoft.com/office/word/2016/wordml/cid" xmlns:w16="http://schemas.microsoft.com/office/word/2018/wordml" xmlns:w16sdtdh="http://schemas.microsoft.com/office/word/2020/wordml/sdtdatahash" xmlns:w16se="http://schemas.microsoft.com/office/word/2015/wordml/symex" xmlns:wpg="http://schemas.microsoft.com/office/word/2010/wordprocessingGroup" xmlns:wpi="http://schemas.microsoft.com/office/word/2010/wordprocessingInk" xmlns:wne="http://schemas.microsoft.com/office/word/2006/wordml" xmlns:wps="http://schemas.microsoft.com/office/word/2010/wordprocessingShape" mc:Ignorable="w14 w15 w16se w16cid w16 w16cex w16sdtdh wp14">
+<w:document xmlns:wpc="http://schemas.microsoft.com/office/word/2010/wordprocessingCanvas" xmlns:cx="http://schemas.microsoft.com/office/drawing/2014/chartex" xmlns:cx1="http://schemas.microsoft.com/office/drawing/2015/9/8/chartex" xmlns:cx2="http://schemas.microsoft.com/office/drawing/2015/10/21/chartex" xmlns:cx3="http://schemas.microsoft.com/office/drawing/2016/5/9/chartex" xmlns:cx4="http://schemas.microsoft.com/office/drawing/2016/5/10/chartex" xmlns:cx5="http://schemas.microsoft.com/office/drawing/2016/5/11/chartex" xmlns:cx6="http://schemas.microsoft.com/office/drawing/2016/5/12/chartex" xmlns:cx7="http://schemas.microsoft.com/office/drawing/2016/5/13/chartex" xmlns:cx8="http://schemas.microsoft.com/office/drawing/2016/5/14/chartex" xmlns:mc="http://schemas.openxmlformats.org/markup-compatibility/2006" xmlns:aink="http://schemas.microsoft.com/office/drawing/2016/ink" xmlns:am3d="http://schemas.microsoft.com/office/drawing/2017/model3d" xmlns:o="urn:schemas-microsoft-com:office:office" xmlns:r="http://schemas.openxmlformats.org/officeDocument/2006/relationships" xmlns:m="http://schemas.openxmlformats.org/officeDocument/2006/math" xmlns:v="urn:schemas-microsoft-com:vml" xmlns:wp14="http://schemas.microsoft.com/office/word/2010/wordprocessingDrawing" xmlns:wp="http://schemas.openxmlformats.org/drawingml/2006/wordprocessingDrawing" xmlns:w10="urn:schemas-microsoft-com:office:word" xmlns:w="http://schemas.openxmlformats.org/wordprocessingml/2006/main" xmlns:w14="http://schemas.microsoft.com/office/word/2010/wordml" xmlns:w15="http://schemas.microsoft.com/office/word/2012/wordml" xmlns:w16cex="http://schemas.microsoft.com/office/word/2018/wordml/cex" xmlns:w16cid="http://schemas.microsoft.com/office/word/2016/wordml/cid" xmlns:w16="http://schemas.microsoft.com/office/word/2018/wordml" xmlns:w16sdtdh="http://schemas.microsoft.com/office/word/2020/wordml/sdtdatahash" xmlns:w16se="http://schemas.microsoft.com/office/word/2015/wordml/symex" xmlns:wpg="http://schemas.microsoft.com/office/word/2010/wordprocessingGroup" xmlns:wpi="http://schemas.microsoft.com/office/word/2010/wordprocessingInk" xmlns:wne="http://schemas.microsoft.com/office/word/2006/wordml" xmlns:wps="http://schemas.microsoft.com/office/word/2010/wordprocessingShape" mc:Ignorable="w14 w15 w16se w16cid w16 w16cex w16sdtdh wp14">
   <w:body>
+    <w:p/>
+    <w:p/>
     <w:p>
       <w:r>
         <w:t xml:space="preserve"> </w:t>
@@ -219,16 +221,297 @@
     <w:p>
       <w:proofErr w:type="spellStart"/>
       <w:r>
+        <w:t>git</w:t>
+      </w:r>
+      <w:proofErr w:type="spellEnd"/>
+      <w:r>
+        <w:t xml:space="preserve"> </w:t>
+      </w:r>
+      <w:proofErr w:type="spellStart"/>
+      <w:r>
+        <w:t>push</w:t>
+      </w:r>
+      <w:proofErr w:type="spellEnd"/>
+      <w:r>
+        <w:t xml:space="preserve"> </w:t>
+      </w:r>
+      <w:proofErr w:type="spellStart"/>
+      <w:r>
+        <w:t>origin</w:t>
+      </w:r>
+      <w:proofErr w:type="spellEnd"/>
+      <w:r>
+        <w:t xml:space="preserve"> </w:t>
+      </w:r>
+      <w:proofErr w:type="spellStart"/>
+      <w:r>
+        <w:t>main</w:t>
+      </w:r>
+      <w:proofErr w:type="spellEnd"/>
+      <w:r>
+        <w:t xml:space="preserve"> // Main es la rama </w:t>
+      </w:r>
+    </w:p>
+    <w:p>
+      <w:r>
+        <w:t xml:space="preserve">Lo cual es: sube los </w:t>
+      </w:r>
+      <w:proofErr w:type="spellStart"/>
+      <w:r>
+        <w:t>commits</w:t>
+      </w:r>
+      <w:proofErr w:type="spellEnd"/>
+      <w:r>
+        <w:t xml:space="preserve"> de la rama </w:t>
+      </w:r>
+      <w:proofErr w:type="spellStart"/>
+      <w:r>
+        <w:t>main</w:t>
+      </w:r>
+      <w:proofErr w:type="spellEnd"/>
+      <w:r>
+        <w:t xml:space="preserve"> local al repositorio remoto llamado </w:t>
+      </w:r>
+      <w:proofErr w:type="spellStart"/>
+      <w:r>
+        <w:t>origin</w:t>
+      </w:r>
+      <w:proofErr w:type="spellEnd"/>
+    </w:p>
+    <w:p>
+      <w:r>
+        <w:t>Importante es ver en que rama local estamos y el nombre del repositorio remoto</w:t>
+      </w:r>
+    </w:p>
+    <w:p/>
+    <w:p>
+      <w:r>
+        <w:t>¿</w:t>
+      </w:r>
+      <w:r>
+        <w:t xml:space="preserve">Como le haces para ver los </w:t>
+      </w:r>
+      <w:proofErr w:type="spellStart"/>
+      <w:r>
+        <w:t>commit</w:t>
+      </w:r>
+      <w:proofErr w:type="spellEnd"/>
+      <w:r>
+        <w:t xml:space="preserve"> que llevas en tu repositorio</w:t>
+      </w:r>
+      <w:r>
+        <w:t xml:space="preserve"> de forma resumida</w:t>
+      </w:r>
+      <w:r>
+        <w:t>?</w:t>
+      </w:r>
+    </w:p>
+    <w:p>
+      <w:proofErr w:type="spellStart"/>
+      <w:r>
+        <w:t>git</w:t>
+      </w:r>
+      <w:proofErr w:type="spellEnd"/>
+      <w:r>
+        <w:t xml:space="preserve"> log </w:t>
+      </w:r>
+      <w:r>
+        <w:t>–</w:t>
+      </w:r>
+      <w:proofErr w:type="spellStart"/>
+      <w:r>
+        <w:t>oneline</w:t>
+      </w:r>
+      <w:proofErr w:type="spellEnd"/>
+    </w:p>
+    <w:p/>
+    <w:p>
+      <w:r>
+        <w:t>Cómo crear una rama</w:t>
+      </w:r>
+    </w:p>
+    <w:p>
+      <w:proofErr w:type="spellStart"/>
+      <w:r>
+        <w:t>git</w:t>
+      </w:r>
+      <w:proofErr w:type="spellEnd"/>
+      <w:r>
+        <w:t xml:space="preserve"> </w:t>
+      </w:r>
+      <w:proofErr w:type="spellStart"/>
+      <w:r>
+        <w:t>branch</w:t>
+      </w:r>
+      <w:proofErr w:type="spellEnd"/>
+      <w:r>
+        <w:t xml:space="preserve"> </w:t>
+      </w:r>
+      <w:r>
+        <w:t>[</w:t>
+      </w:r>
+      <w:r>
+        <w:t>nombre-de-tu-rama</w:t>
+      </w:r>
+      <w:r>
+        <w:t>]</w:t>
+      </w:r>
+    </w:p>
+    <w:p/>
+    <w:p>
+      <w:r>
+        <w:t xml:space="preserve">Algo que hay que tomar en cuenta al crear una rama </w:t>
+      </w:r>
+      <w:proofErr w:type="gramStart"/>
+      <w:r>
+        <w:t>es..</w:t>
+      </w:r>
+      <w:proofErr w:type="gramEnd"/>
+    </w:p>
+    <w:p>
+      <w:r>
+        <w:t>Que hay que moverse a esa rama de donde estamos.</w:t>
+      </w:r>
+    </w:p>
+    <w:p>
+      <w:proofErr w:type="spellStart"/>
+      <w:r>
+        <w:t>git</w:t>
+      </w:r>
+      <w:proofErr w:type="spellEnd"/>
+      <w:r>
+        <w:t xml:space="preserve"> switch </w:t>
+      </w:r>
+      <w:r>
+        <w:t>[</w:t>
+      </w:r>
+      <w:r>
+        <w:t>nombre-de-tu-rama</w:t>
+      </w:r>
+      <w:r>
+        <w:t>]</w:t>
+      </w:r>
+    </w:p>
+    <w:p/>
+    <w:p>
+      <w:r>
+        <w:t>¿Cómo cambiarte de rama?</w:t>
+      </w:r>
+    </w:p>
+    <w:p>
+      <w:proofErr w:type="spellStart"/>
+      <w:r>
+        <w:t>git</w:t>
+      </w:r>
+      <w:proofErr w:type="spellEnd"/>
+      <w:r>
+        <w:t xml:space="preserve"> switch </w:t>
+      </w:r>
+      <w:r>
+        <w:t>[</w:t>
+      </w:r>
+      <w:r>
+        <w:t>nombre-de-tu-rama</w:t>
+      </w:r>
+      <w:r>
+        <w:t>]</w:t>
+      </w:r>
+    </w:p>
+    <w:p/>
+    <w:p>
+      <w:r>
+        <w:t xml:space="preserve">Como visualizar en que </w:t>
+      </w:r>
+      <w:r>
+        <w:t>Rama estamos</w:t>
+      </w:r>
+    </w:p>
+    <w:p>
+      <w:proofErr w:type="spellStart"/>
+      <w:r>
+        <w:t>git</w:t>
+      </w:r>
+      <w:proofErr w:type="spellEnd"/>
+      <w:r>
+        <w:t xml:space="preserve"> </w:t>
+      </w:r>
+      <w:r>
+        <w:t>Branch</w:t>
+      </w:r>
+    </w:p>
+    <w:p/>
+    <w:p/>
+    <w:p>
+      <w:r>
+        <w:t>Como visualizar todas las Ramas (locales y remotas)</w:t>
+      </w:r>
+    </w:p>
+    <w:p>
+      <w:r>
+        <w:t>Git Branch -a</w:t>
+      </w:r>
+    </w:p>
+    <w:p/>
+    <w:p>
+      <w:r>
+        <w:t>¿Cómo traer un repositorio remoto a uno local?</w:t>
+      </w:r>
+    </w:p>
+    <w:p>
+      <w:proofErr w:type="spellStart"/>
+      <w:r>
+        <w:t>git</w:t>
+      </w:r>
+      <w:proofErr w:type="spellEnd"/>
+      <w:r>
+        <w:t xml:space="preserve"> clone </w:t>
+      </w:r>
+      <w:r>
+        <w:t>[URL]</w:t>
+      </w:r>
+    </w:p>
+    <w:p/>
+    <w:p>
+      <w:r>
         <w:lastRenderedPageBreak/>
-        <w:t>git</w:t>
-      </w:r>
-      <w:proofErr w:type="spellEnd"/>
-      <w:r>
-        <w:t xml:space="preserve"> </w:t>
-      </w:r>
-      <w:proofErr w:type="spellStart"/>
-      <w:r>
-        <w:t>push</w:t>
+        <w:t xml:space="preserve">¿Cómo mostrar </w:t>
+      </w:r>
+      <w:r>
+        <w:t>los repositorios remotos conectados</w:t>
+      </w:r>
+      <w:r>
+        <w:t>?</w:t>
+      </w:r>
+    </w:p>
+    <w:p>
+      <w:proofErr w:type="spellStart"/>
+      <w:r>
+        <w:t>git</w:t>
+      </w:r>
+      <w:proofErr w:type="spellEnd"/>
+      <w:r>
+        <w:t xml:space="preserve"> remote -v</w:t>
+      </w:r>
+    </w:p>
+    <w:p>
+      <w:proofErr w:type="gramStart"/>
+      <w:r>
+        <w:t>Cómo conectar un repositorio local con uno remoto?</w:t>
+      </w:r>
+      <w:proofErr w:type="gramEnd"/>
+    </w:p>
+    <w:p>
+      <w:proofErr w:type="spellStart"/>
+      <w:r>
+        <w:t>git</w:t>
+      </w:r>
+      <w:proofErr w:type="spellEnd"/>
+      <w:r>
+        <w:t xml:space="preserve"> remote </w:t>
+      </w:r>
+      <w:proofErr w:type="spellStart"/>
+      <w:r>
+        <w:t>add</w:t>
       </w:r>
       <w:proofErr w:type="spellEnd"/>
       <w:r>
@@ -240,6 +523,38 @@
       </w:r>
       <w:proofErr w:type="spellEnd"/>
       <w:r>
+        <w:t xml:space="preserve"> URL</w:t>
+      </w:r>
+    </w:p>
+    <w:p/>
+    <w:p>
+      <w:r>
+        <w:t>¿Cómo traer los cambios desde el repositorio remoto hacía el repositorio local?</w:t>
+      </w:r>
+    </w:p>
+    <w:p>
+      <w:proofErr w:type="spellStart"/>
+      <w:r>
+        <w:t>git</w:t>
+      </w:r>
+      <w:proofErr w:type="spellEnd"/>
+      <w:r>
+        <w:t xml:space="preserve"> </w:t>
+      </w:r>
+      <w:proofErr w:type="spellStart"/>
+      <w:r>
+        <w:t>pull</w:t>
+      </w:r>
+      <w:proofErr w:type="spellEnd"/>
+      <w:r>
+        <w:t xml:space="preserve"> </w:t>
+      </w:r>
+      <w:proofErr w:type="spellStart"/>
+      <w:r>
+        <w:t>origin</w:t>
+      </w:r>
+      <w:proofErr w:type="spellEnd"/>
+      <w:r>
         <w:t xml:space="preserve"> </w:t>
       </w:r>
       <w:proofErr w:type="spellStart"/>
@@ -247,331 +562,20 @@
         <w:t>main</w:t>
       </w:r>
       <w:proofErr w:type="spellEnd"/>
-      <w:r>
-        <w:t xml:space="preserve"> // Main es la rama </w:t>
-      </w:r>
-    </w:p>
-    <w:p>
-      <w:r>
-        <w:t xml:space="preserve">Lo cual es: sube los </w:t>
-      </w:r>
-      <w:proofErr w:type="spellStart"/>
-      <w:r>
-        <w:t>commits</w:t>
-      </w:r>
-      <w:proofErr w:type="spellEnd"/>
-      <w:r>
-        <w:t xml:space="preserve"> de la rama </w:t>
-      </w:r>
-      <w:proofErr w:type="spellStart"/>
-      <w:r>
-        <w:t>main</w:t>
-      </w:r>
-      <w:proofErr w:type="spellEnd"/>
-      <w:r>
-        <w:t xml:space="preserve"> local al repositorio remoto llamado </w:t>
-      </w:r>
-      <w:proofErr w:type="spellStart"/>
-      <w:r>
-        <w:t>origin</w:t>
-      </w:r>
-      <w:proofErr w:type="spellEnd"/>
-    </w:p>
-    <w:p>
-      <w:r>
-        <w:t>Importante es ver en que rama local estamos y el nombre del repositorio remoto</w:t>
-      </w:r>
-    </w:p>
-    <w:p/>
-    <w:p>
+    </w:p>
+    <w:p/>
+    <w:p/>
+    <w:p>
+      <w:proofErr w:type="gramStart"/>
       <w:r>
         <w:t>¿</w:t>
       </w:r>
       <w:r>
-        <w:t xml:space="preserve">Como le haces para ver los </w:t>
-      </w:r>
-      <w:proofErr w:type="spellStart"/>
-      <w:r>
-        <w:t>commit</w:t>
-      </w:r>
-      <w:proofErr w:type="spellEnd"/>
-      <w:r>
-        <w:t xml:space="preserve"> que llevas en tu repositorio</w:t>
-      </w:r>
-      <w:r>
-        <w:t xml:space="preserve"> de forma resumida</w:t>
-      </w:r>
-      <w:r>
-        <w:t>?</w:t>
-      </w:r>
-    </w:p>
-    <w:p>
-      <w:proofErr w:type="spellStart"/>
-      <w:r>
-        <w:t>git</w:t>
-      </w:r>
-      <w:proofErr w:type="spellEnd"/>
-      <w:r>
-        <w:t xml:space="preserve"> log </w:t>
-      </w:r>
-      <w:r>
-        <w:t>–</w:t>
-      </w:r>
-      <w:proofErr w:type="spellStart"/>
-      <w:r>
-        <w:t>oneline</w:t>
-      </w:r>
-      <w:proofErr w:type="spellEnd"/>
-    </w:p>
-    <w:p/>
-    <w:p>
-      <w:r>
-        <w:t>Cómo crear una rama</w:t>
-      </w:r>
-    </w:p>
-    <w:p>
-      <w:proofErr w:type="spellStart"/>
-      <w:r>
-        <w:t>git</w:t>
-      </w:r>
-      <w:proofErr w:type="spellEnd"/>
-      <w:r>
-        <w:t xml:space="preserve"> </w:t>
-      </w:r>
-      <w:proofErr w:type="spellStart"/>
-      <w:r>
-        <w:t>branch</w:t>
-      </w:r>
-      <w:proofErr w:type="spellEnd"/>
-      <w:r>
-        <w:t xml:space="preserve"> </w:t>
-      </w:r>
-      <w:r>
-        <w:t>[</w:t>
-      </w:r>
-      <w:r>
-        <w:t>nombre-de-tu-rama</w:t>
-      </w:r>
-      <w:r>
-        <w:t>]</w:t>
-      </w:r>
-    </w:p>
-    <w:p/>
-    <w:p>
-      <w:r>
-        <w:t xml:space="preserve">Algo que hay que tomar en cuenta al crear una rama </w:t>
-      </w:r>
-      <w:proofErr w:type="gramStart"/>
-      <w:r>
-        <w:t>es..</w:t>
+        <w:t xml:space="preserve"> cómo</w:t>
       </w:r>
       <w:proofErr w:type="gramEnd"/>
-    </w:p>
-    <w:p>
-      <w:r>
-        <w:t>Que hay que moverse a esa rama de donde estamos.</w:t>
-      </w:r>
-    </w:p>
-    <w:p>
-      <w:proofErr w:type="spellStart"/>
-      <w:r>
-        <w:t>git</w:t>
-      </w:r>
-      <w:proofErr w:type="spellEnd"/>
-      <w:r>
-        <w:t xml:space="preserve"> switch </w:t>
-      </w:r>
-      <w:r>
-        <w:t>[</w:t>
-      </w:r>
-      <w:r>
-        <w:t>nombre-de-tu-rama</w:t>
-      </w:r>
-      <w:r>
-        <w:t>]</w:t>
-      </w:r>
-    </w:p>
-    <w:p/>
-    <w:p>
-      <w:r>
-        <w:t>¿Cómo cambiarte de rama?</w:t>
-      </w:r>
-    </w:p>
-    <w:p>
-      <w:proofErr w:type="spellStart"/>
-      <w:r>
-        <w:t>git</w:t>
-      </w:r>
-      <w:proofErr w:type="spellEnd"/>
-      <w:r>
-        <w:t xml:space="preserve"> switch </w:t>
-      </w:r>
-      <w:r>
-        <w:t>[</w:t>
-      </w:r>
-      <w:r>
-        <w:t>nombre-de-tu-rama</w:t>
-      </w:r>
-      <w:r>
-        <w:t>]</w:t>
-      </w:r>
-    </w:p>
-    <w:p/>
-    <w:p>
-      <w:r>
-        <w:t xml:space="preserve">Como visualizar en que </w:t>
-      </w:r>
-      <w:r>
-        <w:t>Rama estamos</w:t>
-      </w:r>
-    </w:p>
-    <w:p>
-      <w:proofErr w:type="spellStart"/>
-      <w:r>
-        <w:t>git</w:t>
-      </w:r>
-      <w:proofErr w:type="spellEnd"/>
-      <w:r>
-        <w:t xml:space="preserve"> </w:t>
-      </w:r>
-      <w:r>
-        <w:t>Branch</w:t>
-      </w:r>
-    </w:p>
-    <w:p/>
-    <w:p/>
-    <w:p>
-      <w:r>
-        <w:t>Como visualizar todas las Ramas (locales y remotas)</w:t>
-      </w:r>
-    </w:p>
-    <w:p>
-      <w:r>
-        <w:t>Git Branch -a</w:t>
-      </w:r>
-    </w:p>
-    <w:p/>
-    <w:p>
-      <w:r>
-        <w:t>¿Cómo traer un repositorio remoto a uno local?</w:t>
-      </w:r>
-    </w:p>
-    <w:p>
-      <w:proofErr w:type="spellStart"/>
-      <w:r>
-        <w:t>git</w:t>
-      </w:r>
-      <w:proofErr w:type="spellEnd"/>
-      <w:r>
-        <w:t xml:space="preserve"> clone </w:t>
-      </w:r>
-      <w:r>
-        <w:t>[URL]</w:t>
-      </w:r>
-    </w:p>
-    <w:p/>
-    <w:p>
-      <w:r>
-        <w:t xml:space="preserve">¿Cómo mostrar </w:t>
-      </w:r>
-      <w:r>
-        <w:t>los repositorios remotos conectados</w:t>
-      </w:r>
-      <w:r>
-        <w:t>?</w:t>
-      </w:r>
-    </w:p>
-    <w:p>
-      <w:proofErr w:type="spellStart"/>
-      <w:r>
-        <w:t>git</w:t>
-      </w:r>
-      <w:proofErr w:type="spellEnd"/>
-      <w:r>
-        <w:t xml:space="preserve"> remote -v</w:t>
-      </w:r>
-    </w:p>
-    <w:p>
-      <w:proofErr w:type="gramStart"/>
-      <w:r>
-        <w:lastRenderedPageBreak/>
-        <w:t>Cómo conectar un repositorio local con uno remoto?</w:t>
-      </w:r>
-      <w:proofErr w:type="gramEnd"/>
-    </w:p>
-    <w:p>
-      <w:proofErr w:type="spellStart"/>
-      <w:r>
-        <w:t>git</w:t>
-      </w:r>
-      <w:proofErr w:type="spellEnd"/>
-      <w:r>
-        <w:t xml:space="preserve"> remote </w:t>
-      </w:r>
-      <w:proofErr w:type="spellStart"/>
-      <w:r>
-        <w:t>add</w:t>
-      </w:r>
-      <w:proofErr w:type="spellEnd"/>
-      <w:r>
-        <w:t xml:space="preserve"> </w:t>
-      </w:r>
-      <w:proofErr w:type="spellStart"/>
-      <w:r>
-        <w:t>origin</w:t>
-      </w:r>
-      <w:proofErr w:type="spellEnd"/>
-      <w:r>
-        <w:t xml:space="preserve"> URL</w:t>
-      </w:r>
-    </w:p>
-    <w:p/>
-    <w:p>
-      <w:r>
-        <w:t>¿Cómo traer los cambios desde el repositorio remoto hacía el repositorio local?</w:t>
-      </w:r>
-    </w:p>
-    <w:p>
-      <w:proofErr w:type="spellStart"/>
-      <w:r>
-        <w:t>git</w:t>
-      </w:r>
-      <w:proofErr w:type="spellEnd"/>
-      <w:r>
-        <w:t xml:space="preserve"> pull </w:t>
-      </w:r>
-      <w:proofErr w:type="spellStart"/>
-      <w:r>
-        <w:t>origin</w:t>
-      </w:r>
-      <w:proofErr w:type="spellEnd"/>
-      <w:r>
-        <w:t xml:space="preserve"> </w:t>
-      </w:r>
-      <w:proofErr w:type="spellStart"/>
-      <w:r>
-        <w:t>main</w:t>
-      </w:r>
-      <w:proofErr w:type="spellEnd"/>
-    </w:p>
-    <w:p/>
-    <w:p>
-      <w:proofErr w:type="gramStart"/>
-      <w:r>
-        <w:t>¿</w:t>
-      </w:r>
-      <w:r>
-        <w:t xml:space="preserve"> cómo</w:t>
-      </w:r>
-      <w:proofErr w:type="gramEnd"/>
-      <w:r>
-        <w:t xml:space="preserve"> saber en </w:t>
-      </w:r>
-      <w:r>
-        <w:t>qué</w:t>
-      </w:r>
-      <w:r>
-        <w:t xml:space="preserve"> carpeta está mi repositorio</w:t>
+      <w:r>
+        <w:t xml:space="preserve"> saber en qué carpeta está mi repositorio</w:t>
       </w:r>
       <w:r>
         <w:t>?</w:t>
@@ -808,6 +812,7 @@
     <w:p>
       <w:proofErr w:type="spellStart"/>
       <w:r>
+        <w:lastRenderedPageBreak/>
         <w:t>git</w:t>
       </w:r>
       <w:proofErr w:type="spellEnd"/>
@@ -869,10 +874,7 @@
     </w:p>
     <w:p>
       <w:r>
-        <w:t>E</w:t>
-      </w:r>
-      <w:r>
-        <w:t xml:space="preserve">s simplemente una rama temporal creada para desarrollar una funcionalidad específica del proyecto sin tocar directamente </w:t>
+        <w:t xml:space="preserve">Es simplemente una rama temporal creada para desarrollar una funcionalidad específica del proyecto sin tocar directamente </w:t>
       </w:r>
       <w:proofErr w:type="spellStart"/>
       <w:r>
@@ -883,6 +885,39 @@
         <w:t>.</w:t>
       </w:r>
     </w:p>
+    <w:p/>
+    <w:p>
+      <w:r>
+        <w:t>¿Como visualizar en tu repositorio local, ramas que se encuentran en un repositorio remoto?</w:t>
+      </w:r>
+    </w:p>
+    <w:p>
+      <w:proofErr w:type="spellStart"/>
+      <w:r>
+        <w:t>git</w:t>
+      </w:r>
+      <w:proofErr w:type="spellEnd"/>
+      <w:r>
+        <w:t xml:space="preserve"> </w:t>
+      </w:r>
+      <w:proofErr w:type="spellStart"/>
+      <w:r>
+        <w:t>fetch</w:t>
+      </w:r>
+      <w:proofErr w:type="spellEnd"/>
+      <w:r>
+        <w:t xml:space="preserve"> </w:t>
+      </w:r>
+      <w:r>
+        <w:t>- -</w:t>
+      </w:r>
+      <w:proofErr w:type="spellStart"/>
+      <w:r>
+        <w:t>all</w:t>
+      </w:r>
+      <w:proofErr w:type="spellEnd"/>
+    </w:p>
+    <w:p/>
     <w:p/>
     <w:sectPr>
       <w:pgSz w:w="12240" w:h="15840"/>
@@ -1297,6 +1332,7 @@
   <w:style w:type="character" w:default="1" w:styleId="Fuentedeprrafopredeter">
     <w:name w:val="Default Paragraph Font"/>
     <w:uiPriority w:val="1"/>
+    <w:semiHidden/>
     <w:unhideWhenUsed/>
   </w:style>
   <w:style w:type="table" w:default="1" w:styleId="Tablanormal">

</xml_diff>

<commit_message>
Solo agregué 2 preguntas pero el menso no hizo commit y no sé si push
</commit_message>
<xml_diff>
--- a/Apuntes_GIT.docx
+++ b/Apuntes_GIT.docx
@@ -1,6 +1,6 @@
 
 <file path=word/document.xml><?xml version="1.0" encoding="utf-8"?>
-<w:document xmlns:wpc="http://schemas.microsoft.com/office/word/2010/wordprocessingCanvas" xmlns:cx="http://schemas.microsoft.com/office/drawing/2014/chartex" xmlns:cx1="http://schemas.microsoft.com/office/drawing/2015/9/8/chartex" xmlns:cx2="http://schemas.microsoft.com/office/drawing/2015/10/21/chartex" xmlns:cx3="http://schemas.microsoft.com/office/drawing/2016/5/9/chartex" xmlns:cx4="http://schemas.microsoft.com/office/drawing/2016/5/10/chartex" xmlns:cx5="http://schemas.microsoft.com/office/drawing/2016/5/11/chartex" xmlns:cx6="http://schemas.microsoft.com/office/drawing/2016/5/12/chartex" xmlns:cx7="http://schemas.microsoft.com/office/drawing/2016/5/13/chartex" xmlns:cx8="http://schemas.microsoft.com/office/drawing/2016/5/14/chartex" xmlns:mc="http://schemas.openxmlformats.org/markup-compatibility/2006" xmlns:aink="http://schemas.microsoft.com/office/drawing/2016/ink" xmlns:am3d="http://schemas.microsoft.com/office/drawing/2017/model3d" xmlns:o="urn:schemas-microsoft-com:office:office" xmlns:r="http://schemas.openxmlformats.org/officeDocument/2006/relationships" xmlns:m="http://schemas.openxmlformats.org/officeDocument/2006/math" xmlns:v="urn:schemas-microsoft-com:vml" xmlns:wp14="http://schemas.microsoft.com/office/word/2010/wordprocessingDrawing" xmlns:wp="http://schemas.openxmlformats.org/drawingml/2006/wordprocessingDrawing" xmlns:w10="urn:schemas-microsoft-com:office:word" xmlns:w="http://schemas.openxmlformats.org/wordprocessingml/2006/main" xmlns:w14="http://schemas.microsoft.com/office/word/2010/wordml" xmlns:w15="http://schemas.microsoft.com/office/word/2012/wordml" xmlns:w16cex="http://schemas.microsoft.com/office/word/2018/wordml/cex" xmlns:w16cid="http://schemas.microsoft.com/office/word/2016/wordml/cid" xmlns:w16="http://schemas.microsoft.com/office/word/2018/wordml" xmlns:w16sdtdh="http://schemas.microsoft.com/office/word/2020/wordml/sdtdatahash" xmlns:w16se="http://schemas.microsoft.com/office/word/2015/wordml/symex" xmlns:wpg="http://schemas.microsoft.com/office/word/2010/wordprocessingGroup" xmlns:wpi="http://schemas.microsoft.com/office/word/2010/wordprocessingInk" xmlns:wne="http://schemas.microsoft.com/office/word/2006/wordml" xmlns:wps="http://schemas.microsoft.com/office/word/2010/wordprocessingShape" mc:Ignorable="w14 w15 w16se w16cid w16 w16cex w16sdtdh wp14">
+<w:document xmlns:wpc="http://schemas.microsoft.com/office/word/2010/wordprocessingCanvas" xmlns:cx="http://schemas.microsoft.com/office/drawing/2014/chartex" xmlns:cx1="http://schemas.microsoft.com/office/drawing/2015/9/8/chartex" xmlns:cx2="http://schemas.microsoft.com/office/drawing/2015/10/21/chartex" xmlns:cx3="http://schemas.microsoft.com/office/drawing/2016/5/9/chartex" xmlns:cx4="http://schemas.microsoft.com/office/drawing/2016/5/10/chartex" xmlns:cx5="http://schemas.microsoft.com/office/drawing/2016/5/11/chartex" xmlns:cx6="http://schemas.microsoft.com/office/drawing/2016/5/12/chartex" xmlns:cx7="http://schemas.microsoft.com/office/drawing/2016/5/13/chartex" xmlns:cx8="http://schemas.microsoft.com/office/drawing/2016/5/14/chartex" xmlns:mc="http://schemas.openxmlformats.org/markup-compatibility/2006" xmlns:aink="http://schemas.microsoft.com/office/drawing/2016/ink" xmlns:am3d="http://schemas.microsoft.com/office/drawing/2017/model3d" xmlns:o="urn:schemas-microsoft-com:office:office" xmlns:oel="http://schemas.microsoft.com/office/2019/extlst" xmlns:r="http://schemas.openxmlformats.org/officeDocument/2006/relationships" xmlns:m="http://schemas.openxmlformats.org/officeDocument/2006/math" xmlns:v="urn:schemas-microsoft-com:vml" xmlns:wp14="http://schemas.microsoft.com/office/word/2010/wordprocessingDrawing" xmlns:wp="http://schemas.openxmlformats.org/drawingml/2006/wordprocessingDrawing" xmlns:w10="urn:schemas-microsoft-com:office:word" xmlns:w="http://schemas.openxmlformats.org/wordprocessingml/2006/main" xmlns:w14="http://schemas.microsoft.com/office/word/2010/wordml" xmlns:w15="http://schemas.microsoft.com/office/word/2012/wordml" xmlns:w16cex="http://schemas.microsoft.com/office/word/2018/wordml/cex" xmlns:w16cid="http://schemas.microsoft.com/office/word/2016/wordml/cid" xmlns:w16="http://schemas.microsoft.com/office/word/2018/wordml" xmlns:w16sdtdh="http://schemas.microsoft.com/office/word/2020/wordml/sdtdatahash" xmlns:w16se="http://schemas.microsoft.com/office/word/2015/wordml/symex" xmlns:wpg="http://schemas.microsoft.com/office/word/2010/wordprocessingGroup" xmlns:wpi="http://schemas.microsoft.com/office/word/2010/wordprocessingInk" xmlns:wne="http://schemas.microsoft.com/office/word/2006/wordml" xmlns:wps="http://schemas.microsoft.com/office/word/2010/wordprocessingShape" mc:Ignorable="w14 w15 w16se w16cid w16 w16cex w16sdtdh wp14">
   <w:body>
     <w:p/>
     <w:p/>
@@ -34,18 +34,10 @@
         <w:t xml:space="preserve">Acceder a carpeta: </w:t>
       </w:r>
       <w:r>
-        <w:t xml:space="preserve">CMD </w:t>
-      </w:r>
-      <w:proofErr w:type="gramStart"/>
-      <w:r>
-        <w:t>cd:</w:t>
-      </w:r>
-      <w:r>
-        <w:t>[</w:t>
-      </w:r>
-      <w:proofErr w:type="gramEnd"/>
-      <w:r>
-        <w:t>CARPETA]</w:t>
+        <w:t>CMD cd:</w:t>
+      </w:r>
+      <w:r>
+        <w:t>[CARPETA]</w:t>
       </w:r>
       <w:r>
         <w:br/>
@@ -360,13 +352,8 @@
     <w:p/>
     <w:p>
       <w:r>
-        <w:t xml:space="preserve">Algo que hay que tomar en cuenta al crear una rama </w:t>
-      </w:r>
-      <w:proofErr w:type="gramStart"/>
-      <w:r>
-        <w:t>es..</w:t>
-      </w:r>
-      <w:proofErr w:type="gramEnd"/>
+        <w:t>Algo que hay que tomar en cuenta al crear una rama es..</w:t>
+      </w:r>
     </w:p>
     <w:p>
       <w:r>
@@ -494,11 +481,9 @@
       </w:r>
     </w:p>
     <w:p>
-      <w:proofErr w:type="gramStart"/>
       <w:r>
         <w:t>Cómo conectar un repositorio local con uno remoto?</w:t>
       </w:r>
-      <w:proofErr w:type="gramEnd"/>
     </w:p>
     <w:p>
       <w:proofErr w:type="spellStart"/>
@@ -566,16 +551,11 @@
     <w:p/>
     <w:p/>
     <w:p>
-      <w:proofErr w:type="gramStart"/>
       <w:r>
         <w:t>¿</w:t>
       </w:r>
       <w:r>
-        <w:t xml:space="preserve"> cómo</w:t>
-      </w:r>
-      <w:proofErr w:type="gramEnd"/>
-      <w:r>
-        <w:t xml:space="preserve"> saber en qué carpeta está mi repositorio</w:t>
+        <w:t xml:space="preserve"> cómo saber en qué carpeta está mi repositorio</w:t>
       </w:r>
       <w:r>
         <w:t>?</w:t>
@@ -733,7 +713,6 @@
         <w:t xml:space="preserve"> </w:t>
       </w:r>
       <w:proofErr w:type="spellStart"/>
-      <w:proofErr w:type="gramStart"/>
       <w:r>
         <w:t>add</w:t>
       </w:r>
@@ -741,7 +720,6 @@
       <w:r>
         <w:t xml:space="preserve"> .</w:t>
       </w:r>
-      <w:proofErr w:type="gramEnd"/>
     </w:p>
     <w:p>
       <w:proofErr w:type="spellStart"/>
@@ -799,7 +777,6 @@
         <w:t xml:space="preserve"> </w:t>
       </w:r>
       <w:proofErr w:type="spellStart"/>
-      <w:proofErr w:type="gramStart"/>
       <w:r>
         <w:t>add</w:t>
       </w:r>
@@ -807,7 +784,6 @@
       <w:r>
         <w:t xml:space="preserve"> .</w:t>
       </w:r>
-      <w:proofErr w:type="gramEnd"/>
     </w:p>
     <w:p>
       <w:proofErr w:type="spellStart"/>
@@ -918,7 +894,43 @@
       <w:proofErr w:type="spellEnd"/>
     </w:p>
     <w:p/>
-    <w:p/>
+    <w:p>
+      <w:r>
+        <w:t xml:space="preserve">En un comando que significa esta instrucción: -u </w:t>
+      </w:r>
+    </w:p>
+    <w:p>
+      <w:r>
+        <w:t>Significa --set-</w:t>
+      </w:r>
+      <w:proofErr w:type="spellStart"/>
+      <w:r>
+        <w:t>upstream</w:t>
+      </w:r>
+      <w:proofErr w:type="spellEnd"/>
+      <w:r>
+        <w:t>.</w:t>
+      </w:r>
+    </w:p>
+    <w:p/>
+    <w:p>
+      <w:r>
+        <w:t xml:space="preserve">Para que sirve </w:t>
+      </w:r>
+      <w:proofErr w:type="spellStart"/>
+      <w:r>
+        <w:t>upstream</w:t>
+      </w:r>
+      <w:proofErr w:type="spellEnd"/>
+      <w:r>
+        <w:t>?</w:t>
+      </w:r>
+    </w:p>
+    <w:p>
+      <w:r>
+        <w:t>Sirve para dejar configurada una conexión entre el repositorio remoto y una rama local.</w:t>
+      </w:r>
+    </w:p>
     <w:sectPr>
       <w:pgSz w:w="12240" w:h="15840"/>
       <w:pgMar w:top="1417" w:right="1701" w:bottom="1417" w:left="1701" w:header="708" w:footer="708" w:gutter="0"/>

</xml_diff>

<commit_message>
Volví desde ley, y agregue un excel de japones de duolingo
</commit_message>
<xml_diff>
--- a/Apuntes_GIT.docx
+++ b/Apuntes_GIT.docx
@@ -1,6 +1,6 @@
 
 <file path=word/document.xml><?xml version="1.0" encoding="utf-8"?>
-<w:document xmlns:wpc="http://schemas.microsoft.com/office/word/2010/wordprocessingCanvas" xmlns:cx="http://schemas.microsoft.com/office/drawing/2014/chartex" xmlns:cx1="http://schemas.microsoft.com/office/drawing/2015/9/8/chartex" xmlns:cx2="http://schemas.microsoft.com/office/drawing/2015/10/21/chartex" xmlns:cx3="http://schemas.microsoft.com/office/drawing/2016/5/9/chartex" xmlns:cx4="http://schemas.microsoft.com/office/drawing/2016/5/10/chartex" xmlns:cx5="http://schemas.microsoft.com/office/drawing/2016/5/11/chartex" xmlns:cx6="http://schemas.microsoft.com/office/drawing/2016/5/12/chartex" xmlns:cx7="http://schemas.microsoft.com/office/drawing/2016/5/13/chartex" xmlns:cx8="http://schemas.microsoft.com/office/drawing/2016/5/14/chartex" xmlns:mc="http://schemas.openxmlformats.org/markup-compatibility/2006" xmlns:aink="http://schemas.microsoft.com/office/drawing/2016/ink" xmlns:am3d="http://schemas.microsoft.com/office/drawing/2017/model3d" xmlns:o="urn:schemas-microsoft-com:office:office" xmlns:oel="http://schemas.microsoft.com/office/2019/extlst" xmlns:r="http://schemas.openxmlformats.org/officeDocument/2006/relationships" xmlns:m="http://schemas.openxmlformats.org/officeDocument/2006/math" xmlns:v="urn:schemas-microsoft-com:vml" xmlns:wp14="http://schemas.microsoft.com/office/word/2010/wordprocessingDrawing" xmlns:wp="http://schemas.openxmlformats.org/drawingml/2006/wordprocessingDrawing" xmlns:w10="urn:schemas-microsoft-com:office:word" xmlns:w="http://schemas.openxmlformats.org/wordprocessingml/2006/main" xmlns:w14="http://schemas.microsoft.com/office/word/2010/wordml" xmlns:w15="http://schemas.microsoft.com/office/word/2012/wordml" xmlns:w16cex="http://schemas.microsoft.com/office/word/2018/wordml/cex" xmlns:w16cid="http://schemas.microsoft.com/office/word/2016/wordml/cid" xmlns:w16="http://schemas.microsoft.com/office/word/2018/wordml" xmlns:w16sdtdh="http://schemas.microsoft.com/office/word/2020/wordml/sdtdatahash" xmlns:w16se="http://schemas.microsoft.com/office/word/2015/wordml/symex" xmlns:wpg="http://schemas.microsoft.com/office/word/2010/wordprocessingGroup" xmlns:wpi="http://schemas.microsoft.com/office/word/2010/wordprocessingInk" xmlns:wne="http://schemas.microsoft.com/office/word/2006/wordml" xmlns:wps="http://schemas.microsoft.com/office/word/2010/wordprocessingShape" mc:Ignorable="w14 w15 w16se w16cid w16 w16cex w16sdtdh wp14">
+<w:document xmlns:wpc="http://schemas.microsoft.com/office/word/2010/wordprocessingCanvas" xmlns:cx="http://schemas.microsoft.com/office/drawing/2014/chartex" xmlns:cx1="http://schemas.microsoft.com/office/drawing/2015/9/8/chartex" xmlns:cx2="http://schemas.microsoft.com/office/drawing/2015/10/21/chartex" xmlns:cx3="http://schemas.microsoft.com/office/drawing/2016/5/9/chartex" xmlns:cx4="http://schemas.microsoft.com/office/drawing/2016/5/10/chartex" xmlns:cx5="http://schemas.microsoft.com/office/drawing/2016/5/11/chartex" xmlns:cx6="http://schemas.microsoft.com/office/drawing/2016/5/12/chartex" xmlns:cx7="http://schemas.microsoft.com/office/drawing/2016/5/13/chartex" xmlns:cx8="http://schemas.microsoft.com/office/drawing/2016/5/14/chartex" xmlns:mc="http://schemas.openxmlformats.org/markup-compatibility/2006" xmlns:aink="http://schemas.microsoft.com/office/drawing/2016/ink" xmlns:am3d="http://schemas.microsoft.com/office/drawing/2017/model3d" xmlns:o="urn:schemas-microsoft-com:office:office" xmlns:r="http://schemas.openxmlformats.org/officeDocument/2006/relationships" xmlns:m="http://schemas.openxmlformats.org/officeDocument/2006/math" xmlns:v="urn:schemas-microsoft-com:vml" xmlns:wp14="http://schemas.microsoft.com/office/word/2010/wordprocessingDrawing" xmlns:wp="http://schemas.openxmlformats.org/drawingml/2006/wordprocessingDrawing" xmlns:w10="urn:schemas-microsoft-com:office:word" xmlns:w="http://schemas.openxmlformats.org/wordprocessingml/2006/main" xmlns:w14="http://schemas.microsoft.com/office/word/2010/wordml" xmlns:w15="http://schemas.microsoft.com/office/word/2012/wordml" xmlns:w16cex="http://schemas.microsoft.com/office/word/2018/wordml/cex" xmlns:w16cid="http://schemas.microsoft.com/office/word/2016/wordml/cid" xmlns:w16="http://schemas.microsoft.com/office/word/2018/wordml" xmlns:w16sdtdh="http://schemas.microsoft.com/office/word/2020/wordml/sdtdatahash" xmlns:w16se="http://schemas.microsoft.com/office/word/2015/wordml/symex" xmlns:wpg="http://schemas.microsoft.com/office/word/2010/wordprocessingGroup" xmlns:wpi="http://schemas.microsoft.com/office/word/2010/wordprocessingInk" xmlns:wne="http://schemas.microsoft.com/office/word/2006/wordml" xmlns:wps="http://schemas.microsoft.com/office/word/2010/wordprocessingShape" mc:Ignorable="w14 w15 w16se w16cid w16 w16cex w16sdtdh wp14">
   <w:body>
     <w:p/>
     <w:p/>
@@ -34,10 +34,18 @@
         <w:t xml:space="preserve">Acceder a carpeta: </w:t>
       </w:r>
       <w:r>
-        <w:t>CMD cd:</w:t>
-      </w:r>
-      <w:r>
-        <w:t>[CARPETA]</w:t>
+        <w:t xml:space="preserve">CMD </w:t>
+      </w:r>
+      <w:proofErr w:type="gramStart"/>
+      <w:r>
+        <w:t>cd:</w:t>
+      </w:r>
+      <w:r>
+        <w:t>[</w:t>
+      </w:r>
+      <w:proofErr w:type="gramEnd"/>
+      <w:r>
+        <w:t>CARPETA]</w:t>
       </w:r>
       <w:r>
         <w:br/>
@@ -352,8 +360,13 @@
     <w:p/>
     <w:p>
       <w:r>
-        <w:t>Algo que hay que tomar en cuenta al crear una rama es..</w:t>
-      </w:r>
+        <w:t xml:space="preserve">Algo que hay que tomar en cuenta al crear una rama </w:t>
+      </w:r>
+      <w:proofErr w:type="gramStart"/>
+      <w:r>
+        <w:t>es..</w:t>
+      </w:r>
+      <w:proofErr w:type="gramEnd"/>
     </w:p>
     <w:p>
       <w:r>
@@ -481,9 +494,11 @@
       </w:r>
     </w:p>
     <w:p>
+      <w:proofErr w:type="gramStart"/>
       <w:r>
         <w:t>Cómo conectar un repositorio local con uno remoto?</w:t>
       </w:r>
+      <w:proofErr w:type="gramEnd"/>
     </w:p>
     <w:p>
       <w:proofErr w:type="spellStart"/>
@@ -551,11 +566,16 @@
     <w:p/>
     <w:p/>
     <w:p>
+      <w:proofErr w:type="gramStart"/>
       <w:r>
         <w:t>¿</w:t>
       </w:r>
       <w:r>
-        <w:t xml:space="preserve"> cómo saber en qué carpeta está mi repositorio</w:t>
+        <w:t xml:space="preserve"> cómo</w:t>
+      </w:r>
+      <w:proofErr w:type="gramEnd"/>
+      <w:r>
+        <w:t xml:space="preserve"> saber en qué carpeta está mi repositorio</w:t>
       </w:r>
       <w:r>
         <w:t>?</w:t>
@@ -713,6 +733,7 @@
         <w:t xml:space="preserve"> </w:t>
       </w:r>
       <w:proofErr w:type="spellStart"/>
+      <w:proofErr w:type="gramStart"/>
       <w:r>
         <w:t>add</w:t>
       </w:r>
@@ -720,6 +741,7 @@
       <w:r>
         <w:t xml:space="preserve"> .</w:t>
       </w:r>
+      <w:proofErr w:type="gramEnd"/>
     </w:p>
     <w:p>
       <w:proofErr w:type="spellStart"/>
@@ -777,6 +799,7 @@
         <w:t xml:space="preserve"> </w:t>
       </w:r>
       <w:proofErr w:type="spellStart"/>
+      <w:proofErr w:type="gramStart"/>
       <w:r>
         <w:t>add</w:t>
       </w:r>
@@ -784,6 +807,7 @@
       <w:r>
         <w:t xml:space="preserve"> .</w:t>
       </w:r>
+      <w:proofErr w:type="gramEnd"/>
     </w:p>
     <w:p>
       <w:proofErr w:type="spellStart"/>
@@ -864,7 +888,19 @@
     <w:p/>
     <w:p>
       <w:r>
-        <w:t>¿Como visualizar en tu repositorio local, ramas que se encuentran en un repositorio remoto?</w:t>
+        <w:t xml:space="preserve">¿Como </w:t>
+      </w:r>
+      <w:r>
+        <w:t>actualizar</w:t>
+      </w:r>
+      <w:r>
+        <w:t xml:space="preserve"> en tu repositorio local, </w:t>
+      </w:r>
+      <w:r>
+        <w:t xml:space="preserve">las </w:t>
+      </w:r>
+      <w:r>
+        <w:t>ramas que se encuentran en un repositorio remoto?</w:t>
       </w:r>
     </w:p>
     <w:p>
@@ -915,7 +951,18 @@
     <w:p/>
     <w:p>
       <w:r>
-        <w:t xml:space="preserve">Para que sirve </w:t>
+        <w:t>¿</w:t>
+      </w:r>
+      <w:r>
+        <w:t xml:space="preserve">Para </w:t>
+      </w:r>
+      <w:proofErr w:type="spellStart"/>
+      <w:r>
+        <w:t>que</w:t>
+      </w:r>
+      <w:proofErr w:type="spellEnd"/>
+      <w:r>
+        <w:t xml:space="preserve"> sirve </w:t>
       </w:r>
       <w:proofErr w:type="spellStart"/>
       <w:r>

</xml_diff>